<commit_message>
Edited .doc. Add eng, keywords
</commit_message>
<xml_diff>
--- a/Суррогатная нейросеть.docx
+++ b/Суррогатная нейросеть.docx
@@ -30,7 +30,6 @@
       </w:pPr>
       <w:r>
         <w:rPr>
-          <w:rFonts w:ascii="Arial" w:hAnsi="Arial" w:cs="Arial"/>
           <w:b/>
           <w:bCs/>
           <w:i/>
@@ -45,18 +44,79 @@
         <w:pStyle w:val="ac"/>
         <w:spacing w:before="0" w:beforeAutospacing="0" w:after="0" w:afterAutospacing="0"/>
         <w:jc w:val="both"/>
-      </w:pPr>
-      <w:r>
-        <w:rPr>
-          <w:rFonts w:ascii="Arial" w:hAnsi="Arial" w:cs="Arial"/>
+        <w:rPr>
           <w:color w:val="000000"/>
         </w:rPr>
-        <w:t>(кандидат технических наук, профессор АВН, главный специалист Центра специальных транспортных средств ФГУП «НАМИ» г. Москва)</w:t>
-      </w:r>
-    </w:p>
-    <w:p>
-      <w:pPr>
-        <w:ind w:firstLine="709"/>
+      </w:pPr>
+      <w:r>
+        <w:rPr>
+          <w:color w:val="000000"/>
+        </w:rPr>
+        <w:t>Кандидат технических наук, профессор АВН</w:t>
+      </w:r>
+    </w:p>
+    <w:p>
+      <w:pPr>
+        <w:pStyle w:val="ac"/>
+        <w:spacing w:before="0" w:beforeAutospacing="0" w:after="0" w:afterAutospacing="0"/>
+        <w:jc w:val="both"/>
+        <w:rPr>
+          <w:color w:val="000000"/>
+        </w:rPr>
+      </w:pPr>
+      <w:r>
+        <w:rPr>
+          <w:color w:val="000000"/>
+        </w:rPr>
+        <w:t>Главный специалист</w:t>
+      </w:r>
+    </w:p>
+    <w:p>
+      <w:pPr>
+        <w:pStyle w:val="ac"/>
+        <w:spacing w:before="0" w:beforeAutospacing="0" w:after="0" w:afterAutospacing="0"/>
+        <w:jc w:val="both"/>
+        <w:rPr>
+          <w:bCs/>
+        </w:rPr>
+      </w:pPr>
+      <w:r>
+        <w:rPr>
+          <w:bCs/>
+        </w:rPr>
+        <w:t xml:space="preserve">Федеральное государственное унитарное предприятие «Центральный ордена трудового красного знамени научно-исследовательский автомобильный и автомоторный институт «НАМИ, , </w:t>
+      </w:r>
+      <w:r>
+        <w:t>ул. Автомоторная, д. 2, 125438, Москва, РФ.</w:t>
+      </w:r>
+    </w:p>
+    <w:p>
+      <w:pPr>
+        <w:pStyle w:val="ac"/>
+        <w:spacing w:before="0" w:beforeAutospacing="0" w:after="0" w:afterAutospacing="0"/>
+        <w:jc w:val="both"/>
+        <w:rPr>
+          <w:lang w:val="en-US"/>
+        </w:rPr>
+      </w:pPr>
+      <w:r>
+        <w:rPr>
+          <w:bCs/>
+        </w:rPr>
+        <w:t xml:space="preserve">тел.: </w:t>
+      </w:r>
+      <w:r>
+        <w:t>+7 (</w:t>
+      </w:r>
+      <w:r>
+        <w:rPr>
+          <w:lang w:val="en-US"/>
+        </w:rPr>
+        <w:t>906)744-1978</w:t>
+      </w:r>
+    </w:p>
+    <w:p>
+      <w:pPr>
         <w:jc w:val="both"/>
         <w:rPr>
           <w:rFonts w:ascii="Times New Roman" w:hAnsi="Times New Roman" w:cs="Times New Roman"/>
@@ -64,11 +124,11 @@
           <w:bCs/>
           <w:sz w:val="28"/>
           <w:szCs w:val="28"/>
-          <w:lang w:val="en-US"/>
-        </w:rPr>
-      </w:pPr>
-      <w:r>
-        <w:rPr>
+        </w:rPr>
+      </w:pPr>
+      <w:r>
+        <w:rPr>
+          <w:rFonts w:ascii="Times New Roman" w:hAnsi="Times New Roman" w:cs="Times New Roman"/>
           <w:i/>
           <w:iCs/>
           <w:color w:val="000000"/>
@@ -77,21 +137,343 @@
           <w:u w:val="single"/>
           <w:lang w:val="en-US"/>
         </w:rPr>
-        <w:t xml:space="preserve">E-mail: </w:t>
+        <w:t>E</w:t>
+      </w:r>
+      <w:r>
+        <w:rPr>
+          <w:rFonts w:ascii="Times New Roman" w:hAnsi="Times New Roman" w:cs="Times New Roman"/>
+          <w:i/>
+          <w:iCs/>
+          <w:color w:val="000000"/>
+          <w:sz w:val="28"/>
+          <w:szCs w:val="28"/>
+          <w:u w:val="single"/>
+        </w:rPr>
+        <w:t>-</w:t>
+      </w:r>
+      <w:r>
+        <w:rPr>
+          <w:rFonts w:ascii="Times New Roman" w:hAnsi="Times New Roman" w:cs="Times New Roman"/>
+          <w:i/>
+          <w:iCs/>
+          <w:color w:val="000000"/>
+          <w:sz w:val="28"/>
+          <w:szCs w:val="28"/>
+          <w:u w:val="single"/>
+          <w:lang w:val="en-US"/>
+        </w:rPr>
+        <w:t>mail</w:t>
+      </w:r>
+      <w:r>
+        <w:rPr>
+          <w:rFonts w:ascii="Times New Roman" w:hAnsi="Times New Roman" w:cs="Times New Roman"/>
+          <w:i/>
+          <w:iCs/>
+          <w:color w:val="000000"/>
+          <w:sz w:val="28"/>
+          <w:szCs w:val="28"/>
+          <w:u w:val="single"/>
+        </w:rPr>
+        <w:t xml:space="preserve">: </w:t>
       </w:r>
       <w:hyperlink r:id="rId8" w:history="1">
         <w:r>
           <w:rPr>
             <w:rStyle w:val="ad"/>
+            <w:rFonts w:ascii="Times New Roman" w:hAnsi="Times New Roman" w:cs="Times New Roman"/>
             <w:i/>
             <w:iCs/>
             <w:sz w:val="28"/>
             <w:szCs w:val="28"/>
             <w:lang w:val="en-US"/>
           </w:rPr>
-          <w:t>sergey.tabakar@nami.ru</w:t>
+          <w:t>sergey</w:t>
+        </w:r>
+        <w:r>
+          <w:rPr>
+            <w:rStyle w:val="ad"/>
+            <w:rFonts w:ascii="Times New Roman" w:hAnsi="Times New Roman" w:cs="Times New Roman"/>
+            <w:i/>
+            <w:iCs/>
+            <w:sz w:val="28"/>
+            <w:szCs w:val="28"/>
+          </w:rPr>
+          <w:t>.</w:t>
+        </w:r>
+        <w:r>
+          <w:rPr>
+            <w:rStyle w:val="ad"/>
+            <w:rFonts w:ascii="Times New Roman" w:hAnsi="Times New Roman" w:cs="Times New Roman"/>
+            <w:i/>
+            <w:iCs/>
+            <w:sz w:val="28"/>
+            <w:szCs w:val="28"/>
+            <w:lang w:val="en-US"/>
+          </w:rPr>
+          <w:t>tabakar</w:t>
+        </w:r>
+        <w:r>
+          <w:rPr>
+            <w:rStyle w:val="ad"/>
+            <w:rFonts w:ascii="Times New Roman" w:hAnsi="Times New Roman" w:cs="Times New Roman"/>
+            <w:i/>
+            <w:iCs/>
+            <w:sz w:val="28"/>
+            <w:szCs w:val="28"/>
+          </w:rPr>
+          <w:t>@</w:t>
+        </w:r>
+        <w:r>
+          <w:rPr>
+            <w:rStyle w:val="ad"/>
+            <w:rFonts w:ascii="Times New Roman" w:hAnsi="Times New Roman" w:cs="Times New Roman"/>
+            <w:i/>
+            <w:iCs/>
+            <w:sz w:val="28"/>
+            <w:szCs w:val="28"/>
+            <w:lang w:val="en-US"/>
+          </w:rPr>
+          <w:t>nami</w:t>
+        </w:r>
+        <w:r>
+          <w:rPr>
+            <w:rStyle w:val="ad"/>
+            <w:rFonts w:ascii="Times New Roman" w:hAnsi="Times New Roman" w:cs="Times New Roman"/>
+            <w:i/>
+            <w:iCs/>
+            <w:sz w:val="28"/>
+            <w:szCs w:val="28"/>
+          </w:rPr>
+          <w:t>.</w:t>
+        </w:r>
+        <w:proofErr w:type="spellStart"/>
+        <w:r>
+          <w:rPr>
+            <w:rStyle w:val="ad"/>
+            <w:rFonts w:ascii="Times New Roman" w:hAnsi="Times New Roman" w:cs="Times New Roman"/>
+            <w:i/>
+            <w:iCs/>
+            <w:sz w:val="28"/>
+            <w:szCs w:val="28"/>
+            <w:lang w:val="en-US"/>
+          </w:rPr>
+          <w:t>ru</w:t>
+        </w:r>
+        <w:proofErr w:type="spellEnd"/>
+      </w:hyperlink>
+    </w:p>
+    <w:p>
+      <w:pPr>
+        <w:pStyle w:val="ac"/>
+        <w:spacing w:before="0" w:beforeAutospacing="0" w:after="0" w:afterAutospacing="0"/>
+      </w:pPr>
+      <w:r>
+        <w:rPr>
+          <w:b/>
+          <w:bCs/>
+          <w:i/>
+          <w:iCs/>
+          <w:color w:val="000000"/>
+        </w:rPr>
+        <w:t>Алферова Мария Михайловна</w:t>
+      </w:r>
+    </w:p>
+    <w:p>
+      <w:pPr>
+        <w:pStyle w:val="ac"/>
+        <w:spacing w:before="0" w:beforeAutospacing="0" w:after="0" w:afterAutospacing="0"/>
+        <w:jc w:val="both"/>
+        <w:rPr>
+          <w:color w:val="000000"/>
+        </w:rPr>
+      </w:pPr>
+      <w:r>
+        <w:rPr>
+          <w:color w:val="000000"/>
+        </w:rPr>
+        <w:t>Инженер-программист 2 категории</w:t>
+      </w:r>
+    </w:p>
+    <w:p>
+      <w:pPr>
+        <w:pStyle w:val="ac"/>
+        <w:spacing w:before="0" w:beforeAutospacing="0" w:after="0" w:afterAutospacing="0"/>
+        <w:jc w:val="both"/>
+        <w:rPr>
+          <w:bCs/>
+        </w:rPr>
+      </w:pPr>
+      <w:r>
+        <w:rPr>
+          <w:bCs/>
+        </w:rPr>
+        <w:t xml:space="preserve">Федеральное государственное унитарное предприятие «Центральный ордена трудового красного знамени научно-исследовательский автомобильный и автомоторный институт «НАМИ», </w:t>
+      </w:r>
+      <w:r>
+        <w:t>ул. Автомоторная, д. 2, 125438, Москва, РФ.</w:t>
+      </w:r>
+    </w:p>
+    <w:p>
+      <w:pPr>
+        <w:pStyle w:val="ac"/>
+        <w:spacing w:before="0" w:beforeAutospacing="0" w:after="0" w:afterAutospacing="0"/>
+        <w:jc w:val="both"/>
+      </w:pPr>
+      <w:r>
+        <w:rPr>
+          <w:bCs/>
+        </w:rPr>
+        <w:t xml:space="preserve">тел.: </w:t>
+      </w:r>
+      <w:r>
+        <w:t>+7 (903) 562-6143</w:t>
+      </w:r>
+    </w:p>
+    <w:p>
+      <w:pPr>
+        <w:jc w:val="both"/>
+        <w:rPr>
+          <w:rStyle w:val="ad"/>
+          <w:rFonts w:ascii="Times New Roman" w:hAnsi="Times New Roman" w:cs="Times New Roman"/>
+          <w:i/>
+          <w:iCs/>
+          <w:sz w:val="28"/>
+          <w:szCs w:val="28"/>
+        </w:rPr>
+      </w:pPr>
+      <w:r>
+        <w:rPr>
+          <w:rFonts w:ascii="Times New Roman" w:hAnsi="Times New Roman" w:cs="Times New Roman"/>
+          <w:i/>
+          <w:iCs/>
+          <w:color w:val="000000"/>
+          <w:sz w:val="28"/>
+          <w:szCs w:val="28"/>
+          <w:u w:val="single"/>
+          <w:lang w:val="en-US"/>
+        </w:rPr>
+        <w:t>E</w:t>
+      </w:r>
+      <w:r>
+        <w:rPr>
+          <w:rFonts w:ascii="Times New Roman" w:hAnsi="Times New Roman" w:cs="Times New Roman"/>
+          <w:i/>
+          <w:iCs/>
+          <w:color w:val="000000"/>
+          <w:sz w:val="28"/>
+          <w:szCs w:val="28"/>
+          <w:u w:val="single"/>
+        </w:rPr>
+        <w:t>-</w:t>
+      </w:r>
+      <w:r>
+        <w:rPr>
+          <w:rFonts w:ascii="Times New Roman" w:hAnsi="Times New Roman" w:cs="Times New Roman"/>
+          <w:i/>
+          <w:iCs/>
+          <w:color w:val="000000"/>
+          <w:sz w:val="28"/>
+          <w:szCs w:val="28"/>
+          <w:u w:val="single"/>
+          <w:lang w:val="en-US"/>
+        </w:rPr>
+        <w:t>mail</w:t>
+      </w:r>
+      <w:r>
+        <w:rPr>
+          <w:rFonts w:ascii="Times New Roman" w:hAnsi="Times New Roman" w:cs="Times New Roman"/>
+          <w:i/>
+          <w:iCs/>
+          <w:color w:val="000000"/>
+          <w:sz w:val="28"/>
+          <w:szCs w:val="28"/>
+          <w:u w:val="single"/>
+        </w:rPr>
+        <w:t xml:space="preserve">: </w:t>
+      </w:r>
+      <w:hyperlink r:id="rId9" w:history="1">
+        <w:r>
+          <w:rPr>
+            <w:rStyle w:val="ad"/>
+            <w:rFonts w:ascii="Times New Roman" w:hAnsi="Times New Roman" w:cs="Times New Roman"/>
+            <w:i/>
+            <w:iCs/>
+            <w:sz w:val="28"/>
+            <w:szCs w:val="28"/>
+            <w:lang w:val="en-US"/>
+          </w:rPr>
+          <w:t>koteyka</w:t>
+        </w:r>
+        <w:r>
+          <w:rPr>
+            <w:rStyle w:val="ad"/>
+            <w:rFonts w:ascii="Times New Roman" w:hAnsi="Times New Roman" w:cs="Times New Roman"/>
+            <w:i/>
+            <w:iCs/>
+            <w:sz w:val="28"/>
+            <w:szCs w:val="28"/>
+          </w:rPr>
+          <w:t>.</w:t>
+        </w:r>
+        <w:r>
+          <w:rPr>
+            <w:rStyle w:val="ad"/>
+            <w:rFonts w:ascii="Times New Roman" w:hAnsi="Times New Roman" w:cs="Times New Roman"/>
+            <w:i/>
+            <w:iCs/>
+            <w:sz w:val="28"/>
+            <w:szCs w:val="28"/>
+            <w:lang w:val="en-US"/>
+          </w:rPr>
+          <w:t>mn</w:t>
+        </w:r>
+        <w:r>
+          <w:rPr>
+            <w:rStyle w:val="ad"/>
+            <w:rFonts w:ascii="Times New Roman" w:hAnsi="Times New Roman" w:cs="Times New Roman"/>
+            <w:i/>
+            <w:iCs/>
+            <w:sz w:val="28"/>
+            <w:szCs w:val="28"/>
+          </w:rPr>
+          <w:t>@</w:t>
+        </w:r>
+        <w:r>
+          <w:rPr>
+            <w:rStyle w:val="ad"/>
+            <w:rFonts w:ascii="Times New Roman" w:hAnsi="Times New Roman" w:cs="Times New Roman"/>
+            <w:i/>
+            <w:iCs/>
+            <w:sz w:val="28"/>
+            <w:szCs w:val="28"/>
+            <w:lang w:val="en-US"/>
+          </w:rPr>
+          <w:t>gmail</w:t>
+        </w:r>
+        <w:r>
+          <w:rPr>
+            <w:rStyle w:val="ad"/>
+            <w:rFonts w:ascii="Times New Roman" w:hAnsi="Times New Roman" w:cs="Times New Roman"/>
+            <w:i/>
+            <w:iCs/>
+            <w:sz w:val="28"/>
+            <w:szCs w:val="28"/>
+          </w:rPr>
+          <w:t>.</w:t>
         </w:r>
       </w:hyperlink>
+      <w:r>
+        <w:rPr>
+          <w:rStyle w:val="ad"/>
+          <w:rFonts w:ascii="Times New Roman" w:hAnsi="Times New Roman" w:cs="Times New Roman"/>
+          <w:i/>
+          <w:iCs/>
+          <w:sz w:val="28"/>
+          <w:szCs w:val="28"/>
+          <w:lang w:val="en-US"/>
+        </w:rPr>
+        <w:t>com</w:t>
+      </w:r>
     </w:p>
     <w:p>
       <w:pPr>
@@ -103,7 +485,6 @@
           <w:bCs/>
           <w:sz w:val="28"/>
           <w:szCs w:val="28"/>
-          <w:lang w:val="en-US"/>
         </w:rPr>
       </w:pPr>
     </w:p>
@@ -355,6 +736,91 @@
     </w:p>
     <w:p>
       <w:pPr>
+        <w:spacing w:after="0" w:line="240" w:lineRule="auto"/>
+        <w:ind w:firstLine="709"/>
+        <w:jc w:val="both"/>
+        <w:rPr>
+          <w:rFonts w:ascii="Times New Roman" w:hAnsi="Times New Roman" w:cs="Times New Roman"/>
+          <w:sz w:val="28"/>
+          <w:szCs w:val="28"/>
+        </w:rPr>
+      </w:pPr>
+      <w:r>
+        <w:rPr>
+          <w:rFonts w:ascii="Times New Roman" w:hAnsi="Times New Roman" w:cs="Times New Roman"/>
+          <w:b/>
+          <w:sz w:val="28"/>
+          <w:szCs w:val="28"/>
+        </w:rPr>
+        <w:t>Ключевые слова:</w:t>
+      </w:r>
+      <w:r>
+        <w:rPr>
+          <w:rFonts w:ascii="Times New Roman" w:hAnsi="Times New Roman" w:cs="Times New Roman"/>
+          <w:sz w:val="28"/>
+          <w:szCs w:val="28"/>
+        </w:rPr>
+        <w:t xml:space="preserve"> </w:t>
+      </w:r>
+      <w:r>
+        <w:rPr>
+          <w:rFonts w:ascii="Times New Roman" w:hAnsi="Times New Roman" w:cs="Times New Roman"/>
+          <w:sz w:val="28"/>
+          <w:szCs w:val="28"/>
+        </w:rPr>
+        <w:t>ИМИТАЦИОННАЯ МОДЕЛЬ</w:t>
+      </w:r>
+      <w:r>
+        <w:rPr>
+          <w:rFonts w:ascii="Times New Roman" w:hAnsi="Times New Roman" w:cs="Times New Roman"/>
+          <w:sz w:val="28"/>
+          <w:szCs w:val="28"/>
+        </w:rPr>
+        <w:t xml:space="preserve">, </w:t>
+      </w:r>
+      <w:r>
+        <w:rPr>
+          <w:rFonts w:ascii="Times New Roman" w:hAnsi="Times New Roman" w:cs="Times New Roman"/>
+          <w:sz w:val="28"/>
+          <w:szCs w:val="28"/>
+        </w:rPr>
+        <w:t>ПОЛНОСВЯЗНАЯ</w:t>
+      </w:r>
+      <w:r>
+        <w:rPr>
+          <w:rFonts w:ascii="Times New Roman" w:hAnsi="Times New Roman" w:cs="Times New Roman"/>
+          <w:sz w:val="28"/>
+          <w:szCs w:val="28"/>
+        </w:rPr>
+        <w:t xml:space="preserve"> НЕЙРОСЕТЬ</w:t>
+      </w:r>
+      <w:r>
+        <w:rPr>
+          <w:rFonts w:ascii="Times New Roman" w:hAnsi="Times New Roman" w:cs="Times New Roman"/>
+          <w:sz w:val="28"/>
+          <w:szCs w:val="28"/>
+        </w:rPr>
+        <w:t>,</w:t>
+      </w:r>
+      <w:r>
+        <w:rPr>
+          <w:rFonts w:ascii="Times New Roman" w:hAnsi="Times New Roman" w:cs="Times New Roman"/>
+          <w:sz w:val="28"/>
+          <w:szCs w:val="28"/>
+        </w:rPr>
+        <w:t xml:space="preserve"> </w:t>
+      </w:r>
+      <w:r>
+        <w:rPr>
+          <w:rFonts w:ascii="Times New Roman" w:hAnsi="Times New Roman" w:cs="Times New Roman"/>
+          <w:sz w:val="28"/>
+          <w:szCs w:val="28"/>
+        </w:rPr>
+        <w:t>ПОДВИЖНОСТЬ АВТОМОБИЛЯ, ПРОИЗВОДИТЕЛЬНОСТЬ МОДЕЛИ, МОДЕЛЬНЫЙ ЭКСПЕРИМЕНТ</w:t>
+      </w:r>
+    </w:p>
+    <w:p>
+      <w:pPr>
         <w:ind w:firstLine="709"/>
         <w:rPr>
           <w:rFonts w:ascii="Times New Roman" w:hAnsi="Times New Roman" w:cs="Times New Roman"/>
@@ -379,6 +845,7 @@
         <w:rPr>
           <w:sz w:val="28"/>
         </w:rPr>
+        <w:lastRenderedPageBreak/>
         <w:t xml:space="preserve">В качестве инструмента изучения процессов в системе «водитель-автомобиль-дорога-среда» очень часто используются имитационные модели, созданные на основе математических моделей движения </w:t>
       </w:r>
       <w:r>
@@ -508,7 +975,6 @@
         <w:rPr>
           <w:sz w:val="28"/>
         </w:rPr>
-        <w:lastRenderedPageBreak/>
         <w:t xml:space="preserve">Однако, как показала практика моделирования, для описания моделью какого-либо процесса в рассматриваемой системе, требуется достаточно высокая детализация, а вместе с ней, и высокая </w:t>
       </w:r>
       <w:r>
@@ -878,7 +1344,14 @@
         <w:rPr>
           <w:sz w:val="28"/>
         </w:rPr>
-        <w:t xml:space="preserve">применение суррогатной нейросети позволит скрыть от пользователя детали функционирования системы, </w:t>
+        <w:t xml:space="preserve">применение суррогатной нейросети позволит скрыть от </w:t>
+      </w:r>
+      <w:r>
+        <w:rPr>
+          <w:sz w:val="28"/>
+        </w:rPr>
+        <w:lastRenderedPageBreak/>
+        <w:t xml:space="preserve">пользователя детали функционирования системы, </w:t>
       </w:r>
       <w:r>
         <w:rPr>
@@ -1073,7 +1546,6 @@
         <w:rPr>
           <w:noProof/>
         </w:rPr>
-        <w:lastRenderedPageBreak/>
         <w:drawing>
           <wp:inline distT="0" distB="0" distL="0" distR="0" wp14:anchorId="5E6419D4" wp14:editId="3A05AFBE">
             <wp:extent cx="4263241" cy="3102072"/>
@@ -1090,7 +1562,7 @@
                     <pic:cNvPicPr/>
                   </pic:nvPicPr>
                   <pic:blipFill>
-                    <a:blip r:embed="rId9"/>
+                    <a:blip r:embed="rId10"/>
                     <a:stretch>
                       <a:fillRect/>
                     </a:stretch>
@@ -1274,7 +1746,14 @@
         <w:rPr>
           <w:sz w:val="28"/>
         </w:rPr>
-        <w:t>тке будет влиять и скорость входа в него, т.е. начальная скорость автомобиля. Таким образом, входными (варьируемыми) параметрами станут положение дроссельной заслонки, угол уклона дороги и начальная скорость входа на единичный участок маршрута.</w:t>
+        <w:t xml:space="preserve">тке будет влиять и скорость </w:t>
+      </w:r>
+      <w:r>
+        <w:rPr>
+          <w:sz w:val="28"/>
+        </w:rPr>
+        <w:lastRenderedPageBreak/>
+        <w:t>входа в него, т.е. начальная скорость автомобиля. Таким образом, входными (варьируемыми) параметрами станут положение дроссельной заслонки, угол уклона дороги и начальная скорость входа на единичный участок маршрута.</w:t>
       </w:r>
       <w:r>
         <w:rPr>
@@ -1413,9 +1892,853 @@
       <w:r>
         <w:rPr>
           <w:sz w:val="28"/>
+        </w:rPr>
+        <w:instrText xml:space="preserve"> </w:instrText>
+      </w:r>
+      <w:r>
+        <w:rPr>
+          <w:sz w:val="28"/>
           <w:lang w:val="en-US"/>
         </w:rPr>
-        <w:instrText xml:space="preserve"> ADDIN ZOTERO_ITEM CSL_CITATION {"citationID":"TvzVhbTt","properties":{"formattedCitation":"[9]","plainCitation":"[9]","noteIndex":0},"citationItems":[{"id":172,"uris":["http://zotero.org/users/13235738/items/R62K8K5X"],"itemData":{"id":172,"type":"software","license":"Без ограничений","medium":"MATLAB","publisher-place":"Москва","title":"Суррогатная нейросеть","URL":"https://github.com/SergTa/surrogate_neural_net.git","version":"1.0","author":[{"family":"Табакарь","given":"Сергей Ильич"}],"accessed":{"date-parts":[["2026",4,21]]},"issued":{"date-parts":[["2026"]]}}}],"schema":"https://github.com/citation-style-language/schema/raw/master/csl-citation.json"} </w:instrText>
+        <w:instrText>ADDIN</w:instrText>
+      </w:r>
+      <w:r>
+        <w:rPr>
+          <w:sz w:val="28"/>
+        </w:rPr>
+        <w:instrText xml:space="preserve"> </w:instrText>
+      </w:r>
+      <w:r>
+        <w:rPr>
+          <w:sz w:val="28"/>
+          <w:lang w:val="en-US"/>
+        </w:rPr>
+        <w:instrText>ZOTERO</w:instrText>
+      </w:r>
+      <w:r>
+        <w:rPr>
+          <w:sz w:val="28"/>
+        </w:rPr>
+        <w:instrText>_</w:instrText>
+      </w:r>
+      <w:r>
+        <w:rPr>
+          <w:sz w:val="28"/>
+          <w:lang w:val="en-US"/>
+        </w:rPr>
+        <w:instrText>ITEM</w:instrText>
+      </w:r>
+      <w:r>
+        <w:rPr>
+          <w:sz w:val="28"/>
+        </w:rPr>
+        <w:instrText xml:space="preserve"> </w:instrText>
+      </w:r>
+      <w:r>
+        <w:rPr>
+          <w:sz w:val="28"/>
+          <w:lang w:val="en-US"/>
+        </w:rPr>
+        <w:instrText>CSL</w:instrText>
+      </w:r>
+      <w:r>
+        <w:rPr>
+          <w:sz w:val="28"/>
+        </w:rPr>
+        <w:instrText>_</w:instrText>
+      </w:r>
+      <w:r>
+        <w:rPr>
+          <w:sz w:val="28"/>
+          <w:lang w:val="en-US"/>
+        </w:rPr>
+        <w:instrText>CITATION</w:instrText>
+      </w:r>
+      <w:r>
+        <w:rPr>
+          <w:sz w:val="28"/>
+        </w:rPr>
+        <w:instrText xml:space="preserve"> {"</w:instrText>
+      </w:r>
+      <w:r>
+        <w:rPr>
+          <w:sz w:val="28"/>
+          <w:lang w:val="en-US"/>
+        </w:rPr>
+        <w:instrText>citationID</w:instrText>
+      </w:r>
+      <w:r>
+        <w:rPr>
+          <w:sz w:val="28"/>
+        </w:rPr>
+        <w:instrText>":"</w:instrText>
+      </w:r>
+      <w:r>
+        <w:rPr>
+          <w:sz w:val="28"/>
+          <w:lang w:val="en-US"/>
+        </w:rPr>
+        <w:instrText>TvzVhbTt</w:instrText>
+      </w:r>
+      <w:r>
+        <w:rPr>
+          <w:sz w:val="28"/>
+        </w:rPr>
+        <w:instrText>","</w:instrText>
+      </w:r>
+      <w:r>
+        <w:rPr>
+          <w:sz w:val="28"/>
+          <w:lang w:val="en-US"/>
+        </w:rPr>
+        <w:instrText>properties</w:instrText>
+      </w:r>
+      <w:r>
+        <w:rPr>
+          <w:sz w:val="28"/>
+        </w:rPr>
+        <w:instrText>":{"</w:instrText>
+      </w:r>
+      <w:r>
+        <w:rPr>
+          <w:sz w:val="28"/>
+          <w:lang w:val="en-US"/>
+        </w:rPr>
+        <w:instrText>formattedCitation</w:instrText>
+      </w:r>
+      <w:r>
+        <w:rPr>
+          <w:sz w:val="28"/>
+        </w:rPr>
+        <w:instrText>":"[9]","</w:instrText>
+      </w:r>
+      <w:r>
+        <w:rPr>
+          <w:sz w:val="28"/>
+          <w:lang w:val="en-US"/>
+        </w:rPr>
+        <w:instrText>plainCitation</w:instrText>
+      </w:r>
+      <w:r>
+        <w:rPr>
+          <w:sz w:val="28"/>
+        </w:rPr>
+        <w:instrText>":"[9]","</w:instrText>
+      </w:r>
+      <w:r>
+        <w:rPr>
+          <w:sz w:val="28"/>
+          <w:lang w:val="en-US"/>
+        </w:rPr>
+        <w:instrText>noteIndex</w:instrText>
+      </w:r>
+      <w:r>
+        <w:rPr>
+          <w:sz w:val="28"/>
+        </w:rPr>
+        <w:instrText>":0},"</w:instrText>
+      </w:r>
+      <w:r>
+        <w:rPr>
+          <w:sz w:val="28"/>
+          <w:lang w:val="en-US"/>
+        </w:rPr>
+        <w:instrText>citationItems</w:instrText>
+      </w:r>
+      <w:r>
+        <w:rPr>
+          <w:sz w:val="28"/>
+        </w:rPr>
+        <w:instrText>":[{"</w:instrText>
+      </w:r>
+      <w:r>
+        <w:rPr>
+          <w:sz w:val="28"/>
+          <w:lang w:val="en-US"/>
+        </w:rPr>
+        <w:instrText>id</w:instrText>
+      </w:r>
+      <w:r>
+        <w:rPr>
+          <w:sz w:val="28"/>
+        </w:rPr>
+        <w:instrText>":172,"</w:instrText>
+      </w:r>
+      <w:r>
+        <w:rPr>
+          <w:sz w:val="28"/>
+          <w:lang w:val="en-US"/>
+        </w:rPr>
+        <w:instrText>uris</w:instrText>
+      </w:r>
+      <w:r>
+        <w:rPr>
+          <w:sz w:val="28"/>
+        </w:rPr>
+        <w:instrText>":["</w:instrText>
+      </w:r>
+      <w:r>
+        <w:rPr>
+          <w:sz w:val="28"/>
+          <w:lang w:val="en-US"/>
+        </w:rPr>
+        <w:instrText>http</w:instrText>
+      </w:r>
+      <w:r>
+        <w:rPr>
+          <w:sz w:val="28"/>
+        </w:rPr>
+        <w:instrText>://</w:instrText>
+      </w:r>
+      <w:r>
+        <w:rPr>
+          <w:sz w:val="28"/>
+          <w:lang w:val="en-US"/>
+        </w:rPr>
+        <w:instrText>zotero</w:instrText>
+      </w:r>
+      <w:r>
+        <w:rPr>
+          <w:sz w:val="28"/>
+        </w:rPr>
+        <w:instrText>.</w:instrText>
+      </w:r>
+      <w:r>
+        <w:rPr>
+          <w:sz w:val="28"/>
+          <w:lang w:val="en-US"/>
+        </w:rPr>
+        <w:instrText>org</w:instrText>
+      </w:r>
+      <w:r>
+        <w:rPr>
+          <w:sz w:val="28"/>
+        </w:rPr>
+        <w:instrText>/</w:instrText>
+      </w:r>
+      <w:r>
+        <w:rPr>
+          <w:sz w:val="28"/>
+          <w:lang w:val="en-US"/>
+        </w:rPr>
+        <w:instrText>users</w:instrText>
+      </w:r>
+      <w:r>
+        <w:rPr>
+          <w:sz w:val="28"/>
+        </w:rPr>
+        <w:instrText>/13235738/</w:instrText>
+      </w:r>
+      <w:r>
+        <w:rPr>
+          <w:sz w:val="28"/>
+          <w:lang w:val="en-US"/>
+        </w:rPr>
+        <w:instrText>items</w:instrText>
+      </w:r>
+      <w:r>
+        <w:rPr>
+          <w:sz w:val="28"/>
+        </w:rPr>
+        <w:instrText>/</w:instrText>
+      </w:r>
+      <w:r>
+        <w:rPr>
+          <w:sz w:val="28"/>
+          <w:lang w:val="en-US"/>
+        </w:rPr>
+        <w:instrText>R</w:instrText>
+      </w:r>
+      <w:r>
+        <w:rPr>
+          <w:sz w:val="28"/>
+        </w:rPr>
+        <w:instrText>62</w:instrText>
+      </w:r>
+      <w:r>
+        <w:rPr>
+          <w:sz w:val="28"/>
+          <w:lang w:val="en-US"/>
+        </w:rPr>
+        <w:instrText>K</w:instrText>
+      </w:r>
+      <w:r>
+        <w:rPr>
+          <w:sz w:val="28"/>
+        </w:rPr>
+        <w:instrText>8</w:instrText>
+      </w:r>
+      <w:r>
+        <w:rPr>
+          <w:sz w:val="28"/>
+          <w:lang w:val="en-US"/>
+        </w:rPr>
+        <w:instrText>K</w:instrText>
+      </w:r>
+      <w:r>
+        <w:rPr>
+          <w:sz w:val="28"/>
+        </w:rPr>
+        <w:instrText>5</w:instrText>
+      </w:r>
+      <w:r>
+        <w:rPr>
+          <w:sz w:val="28"/>
+          <w:lang w:val="en-US"/>
+        </w:rPr>
+        <w:instrText>X</w:instrText>
+      </w:r>
+      <w:r>
+        <w:rPr>
+          <w:sz w:val="28"/>
+        </w:rPr>
+        <w:instrText>"],"</w:instrText>
+      </w:r>
+      <w:r>
+        <w:rPr>
+          <w:sz w:val="28"/>
+          <w:lang w:val="en-US"/>
+        </w:rPr>
+        <w:instrText>itemData</w:instrText>
+      </w:r>
+      <w:r>
+        <w:rPr>
+          <w:sz w:val="28"/>
+        </w:rPr>
+        <w:instrText>":{"</w:instrText>
+      </w:r>
+      <w:r>
+        <w:rPr>
+          <w:sz w:val="28"/>
+          <w:lang w:val="en-US"/>
+        </w:rPr>
+        <w:instrText>id</w:instrText>
+      </w:r>
+      <w:r>
+        <w:rPr>
+          <w:sz w:val="28"/>
+        </w:rPr>
+        <w:instrText>":172,"</w:instrText>
+      </w:r>
+      <w:r>
+        <w:rPr>
+          <w:sz w:val="28"/>
+          <w:lang w:val="en-US"/>
+        </w:rPr>
+        <w:instrText>type</w:instrText>
+      </w:r>
+      <w:r>
+        <w:rPr>
+          <w:sz w:val="28"/>
+        </w:rPr>
+        <w:instrText>":"</w:instrText>
+      </w:r>
+      <w:r>
+        <w:rPr>
+          <w:sz w:val="28"/>
+          <w:lang w:val="en-US"/>
+        </w:rPr>
+        <w:instrText>software</w:instrText>
+      </w:r>
+      <w:r>
+        <w:rPr>
+          <w:sz w:val="28"/>
+        </w:rPr>
+        <w:instrText>","</w:instrText>
+      </w:r>
+      <w:r>
+        <w:rPr>
+          <w:sz w:val="28"/>
+          <w:lang w:val="en-US"/>
+        </w:rPr>
+        <w:instrText>license</w:instrText>
+      </w:r>
+      <w:r>
+        <w:rPr>
+          <w:sz w:val="28"/>
+        </w:rPr>
+        <w:instrText>":"Без ограничений","</w:instrText>
+      </w:r>
+      <w:r>
+        <w:rPr>
+          <w:sz w:val="28"/>
+          <w:lang w:val="en-US"/>
+        </w:rPr>
+        <w:instrText>medium</w:instrText>
+      </w:r>
+      <w:r>
+        <w:rPr>
+          <w:sz w:val="28"/>
+        </w:rPr>
+        <w:instrText>":"</w:instrText>
+      </w:r>
+      <w:r>
+        <w:rPr>
+          <w:sz w:val="28"/>
+          <w:lang w:val="en-US"/>
+        </w:rPr>
+        <w:instrText>MATLAB</w:instrText>
+      </w:r>
+      <w:r>
+        <w:rPr>
+          <w:sz w:val="28"/>
+        </w:rPr>
+        <w:instrText>","</w:instrText>
+      </w:r>
+      <w:r>
+        <w:rPr>
+          <w:sz w:val="28"/>
+          <w:lang w:val="en-US"/>
+        </w:rPr>
+        <w:instrText>publisher</w:instrText>
+      </w:r>
+      <w:r>
+        <w:rPr>
+          <w:sz w:val="28"/>
+        </w:rPr>
+        <w:instrText>-</w:instrText>
+      </w:r>
+      <w:r>
+        <w:rPr>
+          <w:sz w:val="28"/>
+          <w:lang w:val="en-US"/>
+        </w:rPr>
+        <w:instrText>place</w:instrText>
+      </w:r>
+      <w:r>
+        <w:rPr>
+          <w:sz w:val="28"/>
+        </w:rPr>
+        <w:instrText>":"Москва","</w:instrText>
+      </w:r>
+      <w:r>
+        <w:rPr>
+          <w:sz w:val="28"/>
+          <w:lang w:val="en-US"/>
+        </w:rPr>
+        <w:instrText>title</w:instrText>
+      </w:r>
+      <w:r>
+        <w:rPr>
+          <w:sz w:val="28"/>
+        </w:rPr>
+        <w:instrText>":"Суррогатная нейросеть","</w:instrText>
+      </w:r>
+      <w:r>
+        <w:rPr>
+          <w:sz w:val="28"/>
+          <w:lang w:val="en-US"/>
+        </w:rPr>
+        <w:instrText>URL</w:instrText>
+      </w:r>
+      <w:r>
+        <w:rPr>
+          <w:sz w:val="28"/>
+        </w:rPr>
+        <w:instrText>":"</w:instrText>
+      </w:r>
+      <w:r>
+        <w:rPr>
+          <w:sz w:val="28"/>
+          <w:lang w:val="en-US"/>
+        </w:rPr>
+        <w:instrText>https</w:instrText>
+      </w:r>
+      <w:r>
+        <w:rPr>
+          <w:sz w:val="28"/>
+        </w:rPr>
+        <w:instrText>://</w:instrText>
+      </w:r>
+      <w:r>
+        <w:rPr>
+          <w:sz w:val="28"/>
+          <w:lang w:val="en-US"/>
+        </w:rPr>
+        <w:instrText>github</w:instrText>
+      </w:r>
+      <w:r>
+        <w:rPr>
+          <w:sz w:val="28"/>
+        </w:rPr>
+        <w:instrText>.</w:instrText>
+      </w:r>
+      <w:r>
+        <w:rPr>
+          <w:sz w:val="28"/>
+          <w:lang w:val="en-US"/>
+        </w:rPr>
+        <w:instrText>com</w:instrText>
+      </w:r>
+      <w:r>
+        <w:rPr>
+          <w:sz w:val="28"/>
+        </w:rPr>
+        <w:instrText>/</w:instrText>
+      </w:r>
+      <w:r>
+        <w:rPr>
+          <w:sz w:val="28"/>
+          <w:lang w:val="en-US"/>
+        </w:rPr>
+        <w:instrText>SergTa</w:instrText>
+      </w:r>
+      <w:r>
+        <w:rPr>
+          <w:sz w:val="28"/>
+        </w:rPr>
+        <w:instrText>/</w:instrText>
+      </w:r>
+      <w:r>
+        <w:rPr>
+          <w:sz w:val="28"/>
+          <w:lang w:val="en-US"/>
+        </w:rPr>
+        <w:instrText>surrogate</w:instrText>
+      </w:r>
+      <w:r>
+        <w:rPr>
+          <w:sz w:val="28"/>
+        </w:rPr>
+        <w:instrText>_</w:instrText>
+      </w:r>
+      <w:r>
+        <w:rPr>
+          <w:sz w:val="28"/>
+          <w:lang w:val="en-US"/>
+        </w:rPr>
+        <w:instrText>neural</w:instrText>
+      </w:r>
+      <w:r>
+        <w:rPr>
+          <w:sz w:val="28"/>
+        </w:rPr>
+        <w:instrText>_</w:instrText>
+      </w:r>
+      <w:r>
+        <w:rPr>
+          <w:sz w:val="28"/>
+          <w:lang w:val="en-US"/>
+        </w:rPr>
+        <w:instrText>net</w:instrText>
+      </w:r>
+      <w:r>
+        <w:rPr>
+          <w:sz w:val="28"/>
+        </w:rPr>
+        <w:instrText>.</w:instrText>
+      </w:r>
+      <w:r>
+        <w:rPr>
+          <w:sz w:val="28"/>
+          <w:lang w:val="en-US"/>
+        </w:rPr>
+        <w:instrText>git</w:instrText>
+      </w:r>
+      <w:r>
+        <w:rPr>
+          <w:sz w:val="28"/>
+        </w:rPr>
+        <w:instrText>","</w:instrText>
+      </w:r>
+      <w:r>
+        <w:rPr>
+          <w:sz w:val="28"/>
+          <w:lang w:val="en-US"/>
+        </w:rPr>
+        <w:instrText>version</w:instrText>
+      </w:r>
+      <w:r>
+        <w:rPr>
+          <w:sz w:val="28"/>
+        </w:rPr>
+        <w:instrText>":"1.0","</w:instrText>
+      </w:r>
+      <w:r>
+        <w:rPr>
+          <w:sz w:val="28"/>
+          <w:lang w:val="en-US"/>
+        </w:rPr>
+        <w:instrText>author</w:instrText>
+      </w:r>
+      <w:r>
+        <w:rPr>
+          <w:sz w:val="28"/>
+        </w:rPr>
+        <w:instrText>":[{"</w:instrText>
+      </w:r>
+      <w:r>
+        <w:rPr>
+          <w:sz w:val="28"/>
+          <w:lang w:val="en-US"/>
+        </w:rPr>
+        <w:instrText>family</w:instrText>
+      </w:r>
+      <w:r>
+        <w:rPr>
+          <w:sz w:val="28"/>
+        </w:rPr>
+        <w:instrText>":"Табакарь","</w:instrText>
+      </w:r>
+      <w:r>
+        <w:rPr>
+          <w:sz w:val="28"/>
+          <w:lang w:val="en-US"/>
+        </w:rPr>
+        <w:instrText>given</w:instrText>
+      </w:r>
+      <w:r>
+        <w:rPr>
+          <w:sz w:val="28"/>
+        </w:rPr>
+        <w:instrText>":"Сергей Ильич"}],"</w:instrText>
+      </w:r>
+      <w:r>
+        <w:rPr>
+          <w:sz w:val="28"/>
+          <w:lang w:val="en-US"/>
+        </w:rPr>
+        <w:instrText>accessed</w:instrText>
+      </w:r>
+      <w:r>
+        <w:rPr>
+          <w:sz w:val="28"/>
+        </w:rPr>
+        <w:instrText>":{"</w:instrText>
+      </w:r>
+      <w:r>
+        <w:rPr>
+          <w:sz w:val="28"/>
+          <w:lang w:val="en-US"/>
+        </w:rPr>
+        <w:instrText>date</w:instrText>
+      </w:r>
+      <w:r>
+        <w:rPr>
+          <w:sz w:val="28"/>
+        </w:rPr>
+        <w:instrText>-</w:instrText>
+      </w:r>
+      <w:r>
+        <w:rPr>
+          <w:sz w:val="28"/>
+          <w:lang w:val="en-US"/>
+        </w:rPr>
+        <w:instrText>parts</w:instrText>
+      </w:r>
+      <w:r>
+        <w:rPr>
+          <w:sz w:val="28"/>
+        </w:rPr>
+        <w:instrText>":[["2026",4,21]]},"</w:instrText>
+      </w:r>
+      <w:r>
+        <w:rPr>
+          <w:sz w:val="28"/>
+          <w:lang w:val="en-US"/>
+        </w:rPr>
+        <w:instrText>issued</w:instrText>
+      </w:r>
+      <w:r>
+        <w:rPr>
+          <w:sz w:val="28"/>
+        </w:rPr>
+        <w:instrText>":{"</w:instrText>
+      </w:r>
+      <w:r>
+        <w:rPr>
+          <w:sz w:val="28"/>
+          <w:lang w:val="en-US"/>
+        </w:rPr>
+        <w:instrText>date</w:instrText>
+      </w:r>
+      <w:r>
+        <w:rPr>
+          <w:sz w:val="28"/>
+        </w:rPr>
+        <w:instrText>-</w:instrText>
+      </w:r>
+      <w:r>
+        <w:rPr>
+          <w:sz w:val="28"/>
+          <w:lang w:val="en-US"/>
+        </w:rPr>
+        <w:instrText>parts</w:instrText>
+      </w:r>
+      <w:r>
+        <w:rPr>
+          <w:sz w:val="28"/>
+        </w:rPr>
+        <w:instrText>":[["2026"]]}}}],"</w:instrText>
+      </w:r>
+      <w:r>
+        <w:rPr>
+          <w:sz w:val="28"/>
+          <w:lang w:val="en-US"/>
+        </w:rPr>
+        <w:instrText>schema</w:instrText>
+      </w:r>
+      <w:r>
+        <w:rPr>
+          <w:sz w:val="28"/>
+        </w:rPr>
+        <w:instrText>":"</w:instrText>
+      </w:r>
+      <w:r>
+        <w:rPr>
+          <w:sz w:val="28"/>
+          <w:lang w:val="en-US"/>
+        </w:rPr>
+        <w:instrText>https</w:instrText>
+      </w:r>
+      <w:r>
+        <w:rPr>
+          <w:sz w:val="28"/>
+        </w:rPr>
+        <w:instrText>://</w:instrText>
+      </w:r>
+      <w:r>
+        <w:rPr>
+          <w:sz w:val="28"/>
+          <w:lang w:val="en-US"/>
+        </w:rPr>
+        <w:instrText>github</w:instrText>
+      </w:r>
+      <w:r>
+        <w:rPr>
+          <w:sz w:val="28"/>
+        </w:rPr>
+        <w:instrText>.</w:instrText>
+      </w:r>
+      <w:r>
+        <w:rPr>
+          <w:sz w:val="28"/>
+          <w:lang w:val="en-US"/>
+        </w:rPr>
+        <w:instrText>com</w:instrText>
+      </w:r>
+      <w:r>
+        <w:rPr>
+          <w:sz w:val="28"/>
+        </w:rPr>
+        <w:instrText>/</w:instrText>
+      </w:r>
+      <w:r>
+        <w:rPr>
+          <w:sz w:val="28"/>
+          <w:lang w:val="en-US"/>
+        </w:rPr>
+        <w:instrText>citation</w:instrText>
+      </w:r>
+      <w:r>
+        <w:rPr>
+          <w:sz w:val="28"/>
+        </w:rPr>
+        <w:instrText>-</w:instrText>
+      </w:r>
+      <w:r>
+        <w:rPr>
+          <w:sz w:val="28"/>
+          <w:lang w:val="en-US"/>
+        </w:rPr>
+        <w:instrText>style</w:instrText>
+      </w:r>
+      <w:r>
+        <w:rPr>
+          <w:sz w:val="28"/>
+        </w:rPr>
+        <w:instrText>-</w:instrText>
+      </w:r>
+      <w:r>
+        <w:rPr>
+          <w:sz w:val="28"/>
+          <w:lang w:val="en-US"/>
+        </w:rPr>
+        <w:instrText>language</w:instrText>
+      </w:r>
+      <w:r>
+        <w:rPr>
+          <w:sz w:val="28"/>
+        </w:rPr>
+        <w:instrText>/</w:instrText>
+      </w:r>
+      <w:r>
+        <w:rPr>
+          <w:sz w:val="28"/>
+          <w:lang w:val="en-US"/>
+        </w:rPr>
+        <w:instrText>schema</w:instrText>
+      </w:r>
+      <w:r>
+        <w:rPr>
+          <w:sz w:val="28"/>
+        </w:rPr>
+        <w:instrText>/</w:instrText>
+      </w:r>
+      <w:r>
+        <w:rPr>
+          <w:sz w:val="28"/>
+          <w:lang w:val="en-US"/>
+        </w:rPr>
+        <w:instrText>raw</w:instrText>
+      </w:r>
+      <w:r>
+        <w:rPr>
+          <w:sz w:val="28"/>
+        </w:rPr>
+        <w:instrText>/</w:instrText>
+      </w:r>
+      <w:r>
+        <w:rPr>
+          <w:sz w:val="28"/>
+          <w:lang w:val="en-US"/>
+        </w:rPr>
+        <w:instrText>master</w:instrText>
+      </w:r>
+      <w:r>
+        <w:rPr>
+          <w:sz w:val="28"/>
+        </w:rPr>
+        <w:instrText>/</w:instrText>
+      </w:r>
+      <w:r>
+        <w:rPr>
+          <w:sz w:val="28"/>
+          <w:lang w:val="en-US"/>
+        </w:rPr>
+        <w:instrText>csl</w:instrText>
+      </w:r>
+      <w:r>
+        <w:rPr>
+          <w:sz w:val="28"/>
+        </w:rPr>
+        <w:instrText>-</w:instrText>
+      </w:r>
+      <w:r>
+        <w:rPr>
+          <w:sz w:val="28"/>
+          <w:lang w:val="en-US"/>
+        </w:rPr>
+        <w:instrText>citation</w:instrText>
+      </w:r>
+      <w:r>
+        <w:rPr>
+          <w:sz w:val="28"/>
+        </w:rPr>
+        <w:instrText>.</w:instrText>
+      </w:r>
+      <w:r>
+        <w:rPr>
+          <w:sz w:val="28"/>
+          <w:lang w:val="en-US"/>
+        </w:rPr>
+        <w:instrText>json</w:instrText>
+      </w:r>
+      <w:r>
+        <w:rPr>
+          <w:sz w:val="28"/>
+        </w:rPr>
+        <w:instrText xml:space="preserve">"} </w:instrText>
       </w:r>
       <w:r>
         <w:rPr>
@@ -1464,7 +2787,6 @@
           <w:szCs w:val="21"/>
           <w:lang w:eastAsia="ru-RU"/>
         </w:rPr>
-        <w:lastRenderedPageBreak/>
         <w:t>% Угол подъема, град</w:t>
       </w:r>
     </w:p>
@@ -1962,7 +3284,7 @@
           <w:color w:val="212121"/>
           <w:sz w:val="21"/>
           <w:szCs w:val="21"/>
-          <w:lang w:val="en-US" w:eastAsia="ru-RU"/>
+          <w:lang w:eastAsia="ru-RU"/>
         </w:rPr>
       </w:pPr>
       <w:r>
@@ -1971,7 +3293,7 @@
           <w:color w:val="008013"/>
           <w:sz w:val="21"/>
           <w:szCs w:val="21"/>
-          <w:lang w:val="en-US" w:eastAsia="ru-RU"/>
+          <w:lang w:eastAsia="ru-RU"/>
         </w:rPr>
         <w:t xml:space="preserve">% </w:t>
       </w:r>
@@ -1991,7 +3313,7 @@
           <w:color w:val="008013"/>
           <w:sz w:val="21"/>
           <w:szCs w:val="21"/>
-          <w:lang w:val="en-US" w:eastAsia="ru-RU"/>
+          <w:lang w:eastAsia="ru-RU"/>
         </w:rPr>
         <w:t xml:space="preserve"> </w:t>
       </w:r>
@@ -2011,7 +3333,7 @@
           <w:color w:val="008013"/>
           <w:sz w:val="21"/>
           <w:szCs w:val="21"/>
-          <w:lang w:val="en-US" w:eastAsia="ru-RU"/>
+          <w:lang w:eastAsia="ru-RU"/>
         </w:rPr>
         <w:t xml:space="preserve"> </w:t>
       </w:r>
@@ -2031,7 +3353,7 @@
           <w:color w:val="008013"/>
           <w:sz w:val="21"/>
           <w:szCs w:val="21"/>
-          <w:lang w:val="en-US" w:eastAsia="ru-RU"/>
+          <w:lang w:eastAsia="ru-RU"/>
         </w:rPr>
         <w:t xml:space="preserve"> </w:t>
       </w:r>
@@ -2055,18 +3377,28 @@
           <w:color w:val="212121"/>
           <w:sz w:val="21"/>
           <w:szCs w:val="21"/>
-          <w:lang w:val="en-US" w:eastAsia="ru-RU"/>
-        </w:rPr>
-      </w:pPr>
-      <w:r>
-        <w:rPr>
-          <w:rFonts w:ascii="Consolas" w:eastAsia="Times New Roman" w:hAnsi="Consolas" w:cs="Times New Roman"/>
-          <w:color w:val="212121"/>
-          <w:sz w:val="21"/>
-          <w:szCs w:val="21"/>
-          <w:lang w:val="en-US" w:eastAsia="ru-RU"/>
-        </w:rPr>
-        <w:t xml:space="preserve">theta  = </w:t>
+          <w:lang w:eastAsia="ru-RU"/>
+        </w:rPr>
+      </w:pPr>
+      <w:r>
+        <w:rPr>
+          <w:rFonts w:ascii="Consolas" w:eastAsia="Times New Roman" w:hAnsi="Consolas" w:cs="Times New Roman"/>
+          <w:color w:val="212121"/>
+          <w:sz w:val="21"/>
+          <w:szCs w:val="21"/>
+          <w:lang w:val="en-US" w:eastAsia="ru-RU"/>
+        </w:rPr>
+        <w:t>theta</w:t>
+      </w:r>
+      <w:r>
+        <w:rPr>
+          <w:rFonts w:ascii="Consolas" w:eastAsia="Times New Roman" w:hAnsi="Consolas" w:cs="Times New Roman"/>
+          <w:color w:val="212121"/>
+          <w:sz w:val="21"/>
+          <w:szCs w:val="21"/>
+          <w:lang w:eastAsia="ru-RU"/>
+        </w:rPr>
+        <w:t xml:space="preserve">  = </w:t>
       </w:r>
       <w:proofErr w:type="spellStart"/>
       <w:r>
@@ -2086,73 +3418,127 @@
           <w:color w:val="212121"/>
           <w:sz w:val="21"/>
           <w:szCs w:val="21"/>
-          <w:lang w:val="en-US" w:eastAsia="ru-RU"/>
+          <w:lang w:eastAsia="ru-RU"/>
         </w:rPr>
         <w:t>(</w:t>
       </w:r>
-      <w:proofErr w:type="spellStart"/>
-      <w:r>
-        <w:rPr>
-          <w:rFonts w:ascii="Consolas" w:eastAsia="Times New Roman" w:hAnsi="Consolas" w:cs="Times New Roman"/>
-          <w:color w:val="212121"/>
-          <w:sz w:val="21"/>
-          <w:szCs w:val="21"/>
-          <w:lang w:val="en-US" w:eastAsia="ru-RU"/>
-        </w:rPr>
-        <w:t>theta_min</w:t>
-      </w:r>
-      <w:proofErr w:type="spellEnd"/>
-      <w:r>
-        <w:rPr>
-          <w:rFonts w:ascii="Consolas" w:eastAsia="Times New Roman" w:hAnsi="Consolas" w:cs="Times New Roman"/>
-          <w:color w:val="212121"/>
-          <w:sz w:val="21"/>
-          <w:szCs w:val="21"/>
-          <w:lang w:val="en-US" w:eastAsia="ru-RU"/>
+      <w:r>
+        <w:rPr>
+          <w:rFonts w:ascii="Consolas" w:eastAsia="Times New Roman" w:hAnsi="Consolas" w:cs="Times New Roman"/>
+          <w:color w:val="212121"/>
+          <w:sz w:val="21"/>
+          <w:szCs w:val="21"/>
+          <w:lang w:val="en-US" w:eastAsia="ru-RU"/>
+        </w:rPr>
+        <w:t>theta</w:t>
+      </w:r>
+      <w:r>
+        <w:rPr>
+          <w:rFonts w:ascii="Consolas" w:eastAsia="Times New Roman" w:hAnsi="Consolas" w:cs="Times New Roman"/>
+          <w:color w:val="212121"/>
+          <w:sz w:val="21"/>
+          <w:szCs w:val="21"/>
+          <w:lang w:eastAsia="ru-RU"/>
+        </w:rPr>
+        <w:t>_</w:t>
+      </w:r>
+      <w:r>
+        <w:rPr>
+          <w:rFonts w:ascii="Consolas" w:eastAsia="Times New Roman" w:hAnsi="Consolas" w:cs="Times New Roman"/>
+          <w:color w:val="212121"/>
+          <w:sz w:val="21"/>
+          <w:szCs w:val="21"/>
+          <w:lang w:val="en-US" w:eastAsia="ru-RU"/>
+        </w:rPr>
+        <w:t>min</w:t>
+      </w:r>
+      <w:r>
+        <w:rPr>
+          <w:rFonts w:ascii="Consolas" w:eastAsia="Times New Roman" w:hAnsi="Consolas" w:cs="Times New Roman"/>
+          <w:color w:val="212121"/>
+          <w:sz w:val="21"/>
+          <w:szCs w:val="21"/>
+          <w:lang w:eastAsia="ru-RU"/>
         </w:rPr>
         <w:t xml:space="preserve">,  </w:t>
       </w:r>
-      <w:proofErr w:type="spellStart"/>
-      <w:r>
-        <w:rPr>
-          <w:rFonts w:ascii="Consolas" w:eastAsia="Times New Roman" w:hAnsi="Consolas" w:cs="Times New Roman"/>
-          <w:color w:val="212121"/>
-          <w:sz w:val="21"/>
-          <w:szCs w:val="21"/>
-          <w:lang w:val="en-US" w:eastAsia="ru-RU"/>
-        </w:rPr>
-        <w:t>theta_max</w:t>
-      </w:r>
-      <w:proofErr w:type="spellEnd"/>
-      <w:r>
-        <w:rPr>
-          <w:rFonts w:ascii="Consolas" w:eastAsia="Times New Roman" w:hAnsi="Consolas" w:cs="Times New Roman"/>
-          <w:color w:val="212121"/>
-          <w:sz w:val="21"/>
-          <w:szCs w:val="21"/>
-          <w:lang w:val="en-US" w:eastAsia="ru-RU"/>
+      <w:r>
+        <w:rPr>
+          <w:rFonts w:ascii="Consolas" w:eastAsia="Times New Roman" w:hAnsi="Consolas" w:cs="Times New Roman"/>
+          <w:color w:val="212121"/>
+          <w:sz w:val="21"/>
+          <w:szCs w:val="21"/>
+          <w:lang w:val="en-US" w:eastAsia="ru-RU"/>
+        </w:rPr>
+        <w:t>theta</w:t>
+      </w:r>
+      <w:r>
+        <w:rPr>
+          <w:rFonts w:ascii="Consolas" w:eastAsia="Times New Roman" w:hAnsi="Consolas" w:cs="Times New Roman"/>
+          <w:color w:val="212121"/>
+          <w:sz w:val="21"/>
+          <w:szCs w:val="21"/>
+          <w:lang w:eastAsia="ru-RU"/>
+        </w:rPr>
+        <w:t>_</w:t>
+      </w:r>
+      <w:r>
+        <w:rPr>
+          <w:rFonts w:ascii="Consolas" w:eastAsia="Times New Roman" w:hAnsi="Consolas" w:cs="Times New Roman"/>
+          <w:color w:val="212121"/>
+          <w:sz w:val="21"/>
+          <w:szCs w:val="21"/>
+          <w:lang w:val="en-US" w:eastAsia="ru-RU"/>
+        </w:rPr>
+        <w:t>max</w:t>
+      </w:r>
+      <w:r>
+        <w:rPr>
+          <w:rFonts w:ascii="Consolas" w:eastAsia="Times New Roman" w:hAnsi="Consolas" w:cs="Times New Roman"/>
+          <w:color w:val="212121"/>
+          <w:sz w:val="21"/>
+          <w:szCs w:val="21"/>
+          <w:lang w:eastAsia="ru-RU"/>
         </w:rPr>
         <w:t xml:space="preserve">,  </w:t>
       </w:r>
-      <w:proofErr w:type="spellStart"/>
-      <w:r>
-        <w:rPr>
-          <w:rFonts w:ascii="Consolas" w:eastAsia="Times New Roman" w:hAnsi="Consolas" w:cs="Times New Roman"/>
-          <w:color w:val="212121"/>
-          <w:sz w:val="21"/>
-          <w:szCs w:val="21"/>
-          <w:lang w:val="en-US" w:eastAsia="ru-RU"/>
-        </w:rPr>
-        <w:t>theta_n</w:t>
-      </w:r>
-      <w:proofErr w:type="spellEnd"/>
-      <w:r>
-        <w:rPr>
-          <w:rFonts w:ascii="Consolas" w:eastAsia="Times New Roman" w:hAnsi="Consolas" w:cs="Times New Roman"/>
-          <w:color w:val="212121"/>
-          <w:sz w:val="21"/>
-          <w:szCs w:val="21"/>
-          <w:lang w:val="en-US" w:eastAsia="ru-RU"/>
+      <w:r>
+        <w:rPr>
+          <w:rFonts w:ascii="Consolas" w:eastAsia="Times New Roman" w:hAnsi="Consolas" w:cs="Times New Roman"/>
+          <w:color w:val="212121"/>
+          <w:sz w:val="21"/>
+          <w:szCs w:val="21"/>
+          <w:lang w:val="en-US" w:eastAsia="ru-RU"/>
+        </w:rPr>
+        <w:t>theta</w:t>
+      </w:r>
+      <w:r>
+        <w:rPr>
+          <w:rFonts w:ascii="Consolas" w:eastAsia="Times New Roman" w:hAnsi="Consolas" w:cs="Times New Roman"/>
+          <w:color w:val="212121"/>
+          <w:sz w:val="21"/>
+          <w:szCs w:val="21"/>
+          <w:lang w:eastAsia="ru-RU"/>
+        </w:rPr>
+        <w:t>_</w:t>
+      </w:r>
+      <w:r>
+        <w:rPr>
+          <w:rFonts w:ascii="Consolas" w:eastAsia="Times New Roman" w:hAnsi="Consolas" w:cs="Times New Roman"/>
+          <w:color w:val="212121"/>
+          <w:sz w:val="21"/>
+          <w:szCs w:val="21"/>
+          <w:lang w:val="en-US" w:eastAsia="ru-RU"/>
+        </w:rPr>
+        <w:t>n</w:t>
+      </w:r>
+      <w:r>
+        <w:rPr>
+          <w:rFonts w:ascii="Consolas" w:eastAsia="Times New Roman" w:hAnsi="Consolas" w:cs="Times New Roman"/>
+          <w:color w:val="212121"/>
+          <w:sz w:val="21"/>
+          <w:szCs w:val="21"/>
+          <w:lang w:eastAsia="ru-RU"/>
         </w:rPr>
         <w:t>);</w:t>
       </w:r>
@@ -2694,7 +4080,7 @@
           <w:color w:val="212121"/>
           <w:sz w:val="21"/>
           <w:szCs w:val="21"/>
-          <w:lang w:eastAsia="ru-RU"/>
+          <w:lang w:val="en-US" w:eastAsia="ru-RU"/>
         </w:rPr>
       </w:pPr>
       <w:proofErr w:type="spellStart"/>
@@ -2715,7 +4101,7 @@
           <w:color w:val="212121"/>
           <w:sz w:val="21"/>
           <w:szCs w:val="21"/>
-          <w:lang w:eastAsia="ru-RU"/>
+          <w:lang w:val="en-US" w:eastAsia="ru-RU"/>
         </w:rPr>
         <w:t xml:space="preserve"> = 5;</w:t>
       </w:r>
@@ -3019,7 +4405,7 @@
           <w:color w:val="212121"/>
           <w:sz w:val="21"/>
           <w:szCs w:val="21"/>
-          <w:lang w:val="en-US" w:eastAsia="ru-RU"/>
+          <w:lang w:eastAsia="ru-RU"/>
         </w:rPr>
       </w:pPr>
       <w:r>
@@ -3050,9 +4436,155 @@
           <w:color w:val="212121"/>
           <w:sz w:val="21"/>
           <w:szCs w:val="21"/>
-          <w:lang w:val="en-US" w:eastAsia="ru-RU"/>
-        </w:rPr>
-        <w:t>, N, X(i,1), X(i,2), X(i,3));</w:t>
+          <w:lang w:eastAsia="ru-RU"/>
+        </w:rPr>
+        <w:t xml:space="preserve">, </w:t>
+      </w:r>
+      <w:r>
+        <w:rPr>
+          <w:rFonts w:ascii="Consolas" w:eastAsia="Times New Roman" w:hAnsi="Consolas" w:cs="Times New Roman"/>
+          <w:color w:val="212121"/>
+          <w:sz w:val="21"/>
+          <w:szCs w:val="21"/>
+          <w:lang w:val="en-US" w:eastAsia="ru-RU"/>
+        </w:rPr>
+        <w:t>N</w:t>
+      </w:r>
+      <w:r>
+        <w:rPr>
+          <w:rFonts w:ascii="Consolas" w:eastAsia="Times New Roman" w:hAnsi="Consolas" w:cs="Times New Roman"/>
+          <w:color w:val="212121"/>
+          <w:sz w:val="21"/>
+          <w:szCs w:val="21"/>
+          <w:lang w:eastAsia="ru-RU"/>
+        </w:rPr>
+        <w:t xml:space="preserve">, </w:t>
+      </w:r>
+      <w:r>
+        <w:rPr>
+          <w:rFonts w:ascii="Consolas" w:eastAsia="Times New Roman" w:hAnsi="Consolas" w:cs="Times New Roman"/>
+          <w:color w:val="212121"/>
+          <w:sz w:val="21"/>
+          <w:szCs w:val="21"/>
+          <w:lang w:val="en-US" w:eastAsia="ru-RU"/>
+        </w:rPr>
+        <w:t>X</w:t>
+      </w:r>
+      <w:r>
+        <w:rPr>
+          <w:rFonts w:ascii="Consolas" w:eastAsia="Times New Roman" w:hAnsi="Consolas" w:cs="Times New Roman"/>
+          <w:color w:val="212121"/>
+          <w:sz w:val="21"/>
+          <w:szCs w:val="21"/>
+          <w:lang w:eastAsia="ru-RU"/>
+        </w:rPr>
+        <w:t>(</w:t>
+      </w:r>
+      <w:proofErr w:type="spellStart"/>
+      <w:r>
+        <w:rPr>
+          <w:rFonts w:ascii="Consolas" w:eastAsia="Times New Roman" w:hAnsi="Consolas" w:cs="Times New Roman"/>
+          <w:color w:val="212121"/>
+          <w:sz w:val="21"/>
+          <w:szCs w:val="21"/>
+          <w:lang w:val="en-US" w:eastAsia="ru-RU"/>
+        </w:rPr>
+        <w:t>i</w:t>
+      </w:r>
+      <w:proofErr w:type="spellEnd"/>
+      <w:r>
+        <w:rPr>
+          <w:rFonts w:ascii="Consolas" w:eastAsia="Times New Roman" w:hAnsi="Consolas" w:cs="Times New Roman"/>
+          <w:color w:val="212121"/>
+          <w:sz w:val="21"/>
+          <w:szCs w:val="21"/>
+          <w:lang w:eastAsia="ru-RU"/>
+        </w:rPr>
+        <w:t xml:space="preserve">,1), </w:t>
+      </w:r>
+      <w:r>
+        <w:rPr>
+          <w:rFonts w:ascii="Consolas" w:eastAsia="Times New Roman" w:hAnsi="Consolas" w:cs="Times New Roman"/>
+          <w:color w:val="212121"/>
+          <w:sz w:val="21"/>
+          <w:szCs w:val="21"/>
+          <w:lang w:val="en-US" w:eastAsia="ru-RU"/>
+        </w:rPr>
+        <w:t>X</w:t>
+      </w:r>
+      <w:r>
+        <w:rPr>
+          <w:rFonts w:ascii="Consolas" w:eastAsia="Times New Roman" w:hAnsi="Consolas" w:cs="Times New Roman"/>
+          <w:color w:val="212121"/>
+          <w:sz w:val="21"/>
+          <w:szCs w:val="21"/>
+          <w:lang w:eastAsia="ru-RU"/>
+        </w:rPr>
+        <w:t>(</w:t>
+      </w:r>
+      <w:proofErr w:type="spellStart"/>
+      <w:r>
+        <w:rPr>
+          <w:rFonts w:ascii="Consolas" w:eastAsia="Times New Roman" w:hAnsi="Consolas" w:cs="Times New Roman"/>
+          <w:color w:val="212121"/>
+          <w:sz w:val="21"/>
+          <w:szCs w:val="21"/>
+          <w:lang w:val="en-US" w:eastAsia="ru-RU"/>
+        </w:rPr>
+        <w:t>i</w:t>
+      </w:r>
+      <w:proofErr w:type="spellEnd"/>
+      <w:r>
+        <w:rPr>
+          <w:rFonts w:ascii="Consolas" w:eastAsia="Times New Roman" w:hAnsi="Consolas" w:cs="Times New Roman"/>
+          <w:color w:val="212121"/>
+          <w:sz w:val="21"/>
+          <w:szCs w:val="21"/>
+          <w:lang w:eastAsia="ru-RU"/>
+        </w:rPr>
+        <w:t xml:space="preserve">,2), </w:t>
+      </w:r>
+      <w:r>
+        <w:rPr>
+          <w:rFonts w:ascii="Consolas" w:eastAsia="Times New Roman" w:hAnsi="Consolas" w:cs="Times New Roman"/>
+          <w:color w:val="212121"/>
+          <w:sz w:val="21"/>
+          <w:szCs w:val="21"/>
+          <w:lang w:val="en-US" w:eastAsia="ru-RU"/>
+        </w:rPr>
+        <w:t>X</w:t>
+      </w:r>
+      <w:r>
+        <w:rPr>
+          <w:rFonts w:ascii="Consolas" w:eastAsia="Times New Roman" w:hAnsi="Consolas" w:cs="Times New Roman"/>
+          <w:color w:val="212121"/>
+          <w:sz w:val="21"/>
+          <w:szCs w:val="21"/>
+          <w:lang w:eastAsia="ru-RU"/>
+        </w:rPr>
+        <w:t>(</w:t>
+      </w:r>
+      <w:proofErr w:type="spellStart"/>
+      <w:r>
+        <w:rPr>
+          <w:rFonts w:ascii="Consolas" w:eastAsia="Times New Roman" w:hAnsi="Consolas" w:cs="Times New Roman"/>
+          <w:color w:val="212121"/>
+          <w:sz w:val="21"/>
+          <w:szCs w:val="21"/>
+          <w:lang w:val="en-US" w:eastAsia="ru-RU"/>
+        </w:rPr>
+        <w:t>i</w:t>
+      </w:r>
+      <w:proofErr w:type="spellEnd"/>
+      <w:r>
+        <w:rPr>
+          <w:rFonts w:ascii="Consolas" w:eastAsia="Times New Roman" w:hAnsi="Consolas" w:cs="Times New Roman"/>
+          <w:color w:val="212121"/>
+          <w:sz w:val="21"/>
+          <w:szCs w:val="21"/>
+          <w:lang w:eastAsia="ru-RU"/>
+        </w:rPr>
+        <w:t>,3));</w:t>
       </w:r>
     </w:p>
     <w:p>
@@ -3064,16 +4596,16 @@
           <w:color w:val="212121"/>
           <w:sz w:val="21"/>
           <w:szCs w:val="21"/>
-          <w:lang w:val="en-US" w:eastAsia="ru-RU"/>
-        </w:rPr>
-      </w:pPr>
-      <w:r>
-        <w:rPr>
-          <w:rFonts w:ascii="Consolas" w:eastAsia="Times New Roman" w:hAnsi="Consolas" w:cs="Times New Roman"/>
-          <w:color w:val="212121"/>
-          <w:sz w:val="21"/>
-          <w:szCs w:val="21"/>
-          <w:lang w:val="en-US" w:eastAsia="ru-RU"/>
+          <w:lang w:eastAsia="ru-RU"/>
+        </w:rPr>
+      </w:pPr>
+      <w:r>
+        <w:rPr>
+          <w:rFonts w:ascii="Consolas" w:eastAsia="Times New Roman" w:hAnsi="Consolas" w:cs="Times New Roman"/>
+          <w:color w:val="212121"/>
+          <w:sz w:val="21"/>
+          <w:szCs w:val="21"/>
+          <w:lang w:eastAsia="ru-RU"/>
         </w:rPr>
         <w:t xml:space="preserve">    </w:t>
       </w:r>
@@ -3087,16 +4619,16 @@
           <w:color w:val="212121"/>
           <w:sz w:val="21"/>
           <w:szCs w:val="21"/>
-          <w:lang w:val="en-US" w:eastAsia="ru-RU"/>
-        </w:rPr>
-      </w:pPr>
-      <w:r>
-        <w:rPr>
-          <w:rFonts w:ascii="Consolas" w:eastAsia="Times New Roman" w:hAnsi="Consolas" w:cs="Times New Roman"/>
-          <w:color w:val="212121"/>
-          <w:sz w:val="21"/>
-          <w:szCs w:val="21"/>
-          <w:lang w:val="en-US" w:eastAsia="ru-RU"/>
+          <w:lang w:eastAsia="ru-RU"/>
+        </w:rPr>
+      </w:pPr>
+      <w:r>
+        <w:rPr>
+          <w:rFonts w:ascii="Consolas" w:eastAsia="Times New Roman" w:hAnsi="Consolas" w:cs="Times New Roman"/>
+          <w:color w:val="212121"/>
+          <w:sz w:val="21"/>
+          <w:szCs w:val="21"/>
+          <w:lang w:eastAsia="ru-RU"/>
         </w:rPr>
         <w:t xml:space="preserve">    </w:t>
       </w:r>
@@ -3106,7 +4638,7 @@
           <w:color w:val="008013"/>
           <w:sz w:val="21"/>
           <w:szCs w:val="21"/>
-          <w:lang w:val="en-US" w:eastAsia="ru-RU"/>
+          <w:lang w:eastAsia="ru-RU"/>
         </w:rPr>
         <w:t xml:space="preserve">% </w:t>
       </w:r>
@@ -3126,7 +4658,7 @@
           <w:color w:val="008013"/>
           <w:sz w:val="21"/>
           <w:szCs w:val="21"/>
-          <w:lang w:val="en-US" w:eastAsia="ru-RU"/>
+          <w:lang w:eastAsia="ru-RU"/>
         </w:rPr>
         <w:t xml:space="preserve"> </w:t>
       </w:r>
@@ -3150,16 +4682,16 @@
           <w:color w:val="212121"/>
           <w:sz w:val="21"/>
           <w:szCs w:val="21"/>
-          <w:lang w:val="en-US" w:eastAsia="ru-RU"/>
-        </w:rPr>
-      </w:pPr>
-      <w:r>
-        <w:rPr>
-          <w:rFonts w:ascii="Consolas" w:eastAsia="Times New Roman" w:hAnsi="Consolas" w:cs="Times New Roman"/>
-          <w:color w:val="212121"/>
-          <w:sz w:val="21"/>
-          <w:szCs w:val="21"/>
-          <w:lang w:val="en-US" w:eastAsia="ru-RU"/>
+          <w:lang w:eastAsia="ru-RU"/>
+        </w:rPr>
+      </w:pPr>
+      <w:r>
+        <w:rPr>
+          <w:rFonts w:ascii="Consolas" w:eastAsia="Times New Roman" w:hAnsi="Consolas" w:cs="Times New Roman"/>
+          <w:color w:val="212121"/>
+          <w:sz w:val="21"/>
+          <w:szCs w:val="21"/>
+          <w:lang w:eastAsia="ru-RU"/>
         </w:rPr>
         <w:t xml:space="preserve">    </w:t>
       </w:r>
@@ -3182,7 +4714,7 @@
           <w:color w:val="212121"/>
           <w:sz w:val="21"/>
           <w:szCs w:val="21"/>
-          <w:lang w:val="en-US" w:eastAsia="ru-RU"/>
+          <w:lang w:eastAsia="ru-RU"/>
         </w:rPr>
         <w:t xml:space="preserve">    </w:t>
       </w:r>
@@ -3665,6 +5197,7 @@
           <w:szCs w:val="21"/>
           <w:lang w:val="en-US" w:eastAsia="ru-RU"/>
         </w:rPr>
+        <w:lastRenderedPageBreak/>
         <w:t xml:space="preserve">    out = sim(</w:t>
       </w:r>
       <w:r>
@@ -4425,7 +5958,6 @@
           <w:szCs w:val="21"/>
           <w:lang w:val="en-US" w:eastAsia="ru-RU"/>
         </w:rPr>
-        <w:lastRenderedPageBreak/>
         <w:t xml:space="preserve">    </w:t>
       </w:r>
       <w:proofErr w:type="spellStart"/>
@@ -4802,7 +6334,7 @@
           <w:color w:val="212121"/>
           <w:sz w:val="21"/>
           <w:szCs w:val="21"/>
-          <w:lang w:val="en-US" w:eastAsia="ru-RU"/>
+          <w:lang w:eastAsia="ru-RU"/>
         </w:rPr>
       </w:pPr>
       <w:r>
@@ -4821,7 +6353,7 @@
           <w:color w:val="212121"/>
           <w:sz w:val="21"/>
           <w:szCs w:val="21"/>
-          <w:lang w:val="en-US" w:eastAsia="ru-RU"/>
+          <w:lang w:eastAsia="ru-RU"/>
         </w:rPr>
         <w:t>(</w:t>
       </w:r>
@@ -4841,7 +6373,7 @@
           <w:color w:val="212121"/>
           <w:sz w:val="21"/>
           <w:szCs w:val="21"/>
-          <w:lang w:val="en-US" w:eastAsia="ru-RU"/>
+          <w:lang w:eastAsia="ru-RU"/>
         </w:rPr>
         <w:t>(</w:t>
       </w:r>
@@ -4861,10 +6393,11 @@
           <w:color w:val="212121"/>
           <w:sz w:val="21"/>
           <w:szCs w:val="21"/>
-          <w:lang w:val="en-US" w:eastAsia="ru-RU"/>
+          <w:lang w:eastAsia="ru-RU"/>
         </w:rPr>
         <w:t>.</w:t>
       </w:r>
+      <w:proofErr w:type="spellStart"/>
       <w:r>
         <w:rPr>
           <w:rFonts w:ascii="Consolas" w:eastAsia="Times New Roman" w:hAnsi="Consolas" w:cs="Times New Roman"/>
@@ -4875,13 +6408,14 @@
         </w:rPr>
         <w:t>simlog</w:t>
       </w:r>
-      <w:r>
-        <w:rPr>
-          <w:rFonts w:ascii="Consolas" w:eastAsia="Times New Roman" w:hAnsi="Consolas" w:cs="Times New Roman"/>
-          <w:color w:val="212121"/>
-          <w:sz w:val="21"/>
-          <w:szCs w:val="21"/>
-          <w:lang w:val="en-US" w:eastAsia="ru-RU"/>
+      <w:proofErr w:type="spellEnd"/>
+      <w:r>
+        <w:rPr>
+          <w:rFonts w:ascii="Consolas" w:eastAsia="Times New Roman" w:hAnsi="Consolas" w:cs="Times New Roman"/>
+          <w:color w:val="212121"/>
+          <w:sz w:val="21"/>
+          <w:szCs w:val="21"/>
+          <w:lang w:eastAsia="ru-RU"/>
         </w:rPr>
         <w:t>_</w:t>
       </w:r>
@@ -4901,7 +6435,7 @@
           <w:color w:val="212121"/>
           <w:sz w:val="21"/>
           <w:szCs w:val="21"/>
-          <w:lang w:val="en-US" w:eastAsia="ru-RU"/>
+          <w:lang w:eastAsia="ru-RU"/>
         </w:rPr>
         <w:t>_4</w:t>
       </w:r>
@@ -4921,7 +6455,7 @@
           <w:color w:val="212121"/>
           <w:sz w:val="21"/>
           <w:szCs w:val="21"/>
-          <w:lang w:val="en-US" w:eastAsia="ru-RU"/>
+          <w:lang w:eastAsia="ru-RU"/>
         </w:rPr>
         <w:t>.</w:t>
       </w:r>
@@ -4941,7 +6475,7 @@
           <w:color w:val="212121"/>
           <w:sz w:val="21"/>
           <w:szCs w:val="21"/>
-          <w:lang w:val="en-US" w:eastAsia="ru-RU"/>
+          <w:lang w:eastAsia="ru-RU"/>
         </w:rPr>
         <w:t>_</w:t>
       </w:r>
@@ -4961,7 +6495,7 @@
           <w:color w:val="212121"/>
           <w:sz w:val="21"/>
           <w:szCs w:val="21"/>
-          <w:lang w:val="en-US" w:eastAsia="ru-RU"/>
+          <w:lang w:eastAsia="ru-RU"/>
         </w:rPr>
         <w:t>.</w:t>
       </w:r>
@@ -4981,7 +6515,7 @@
           <w:color w:val="212121"/>
           <w:sz w:val="21"/>
           <w:szCs w:val="21"/>
-          <w:lang w:val="en-US" w:eastAsia="ru-RU"/>
+          <w:lang w:eastAsia="ru-RU"/>
         </w:rPr>
         <w:t>.</w:t>
       </w:r>
@@ -5001,7 +6535,7 @@
           <w:color w:val="212121"/>
           <w:sz w:val="21"/>
           <w:szCs w:val="21"/>
-          <w:lang w:val="en-US" w:eastAsia="ru-RU"/>
+          <w:lang w:eastAsia="ru-RU"/>
         </w:rPr>
         <w:t xml:space="preserve">), </w:t>
       </w:r>
@@ -5011,7 +6545,7 @@
           <w:color w:val="0E00FF"/>
           <w:sz w:val="21"/>
           <w:szCs w:val="21"/>
-          <w:lang w:val="en-US" w:eastAsia="ru-RU"/>
+          <w:lang w:eastAsia="ru-RU"/>
         </w:rPr>
         <w:t>...</w:t>
       </w:r>
@@ -5034,7 +6568,7 @@
           <w:color w:val="212121"/>
           <w:sz w:val="21"/>
           <w:szCs w:val="21"/>
-          <w:lang w:val="en-US" w:eastAsia="ru-RU"/>
+          <w:lang w:eastAsia="ru-RU"/>
         </w:rPr>
         <w:t xml:space="preserve">     </w:t>
       </w:r>
@@ -5174,7 +6708,7 @@
                     </pic:cNvPicPr>
                   </pic:nvPicPr>
                   <pic:blipFill>
-                    <a:blip r:embed="rId10">
+                    <a:blip r:embed="rId11">
                       <a:extLst>
                         <a:ext uri="{28A0092B-C50C-407E-A947-70E740481C1C}">
                           <a14:useLocalDpi xmlns:a14="http://schemas.microsoft.com/office/drawing/2010/main" val="0"/>
@@ -5273,6 +6807,7 @@
         <w:rPr>
           <w:sz w:val="28"/>
         </w:rPr>
+        <w:lastRenderedPageBreak/>
         <w:t>Следующим этапом необходимо обработать выбросы и пропуски, то есть, очистить неудачные попытки моделирования</w:t>
       </w:r>
       <w:r>
@@ -5886,7 +7421,6 @@
         <w:rPr>
           <w:sz w:val="28"/>
         </w:rPr>
-        <w:lastRenderedPageBreak/>
         <w:t>Проведем нормирование данных:</w:t>
       </w:r>
     </w:p>
@@ -7592,6 +9126,7 @@
           <w:szCs w:val="24"/>
           <w:lang w:eastAsia="ru-RU"/>
         </w:rPr>
+        <w:lastRenderedPageBreak/>
         <w:drawing>
           <wp:inline distT="0" distB="0" distL="0" distR="0" wp14:anchorId="4A6812F6" wp14:editId="2E16D28B">
             <wp:extent cx="5940425" cy="2952115"/>
@@ -7610,7 +9145,7 @@
                     </pic:cNvPicPr>
                   </pic:nvPicPr>
                   <pic:blipFill>
-                    <a:blip r:embed="rId11">
+                    <a:blip r:embed="rId12">
                       <a:extLst>
                         <a:ext uri="{28A0092B-C50C-407E-A947-70E740481C1C}">
                           <a14:useLocalDpi xmlns:a14="http://schemas.microsoft.com/office/drawing/2010/main" val="0"/>
@@ -7696,7 +9231,6 @@
         <w:rPr>
           <w:sz w:val="28"/>
         </w:rPr>
-        <w:lastRenderedPageBreak/>
         <w:t>Как видно из рисунка 3, уже к 400 итерации величина ошибки и потерь стабилизируется и характеризуется лишь необъясненной выбранными параметрами дисперсией</w:t>
       </w:r>
       <w:r>
@@ -7803,7 +9337,7 @@
                     </pic:cNvPicPr>
                   </pic:nvPicPr>
                   <pic:blipFill>
-                    <a:blip r:embed="rId12">
+                    <a:blip r:embed="rId13">
                       <a:extLst>
                         <a:ext uri="{28A0092B-C50C-407E-A947-70E740481C1C}">
                           <a14:useLocalDpi xmlns:a14="http://schemas.microsoft.com/office/drawing/2010/main" val="0"/>
@@ -7883,6 +9417,7 @@
         <w:rPr>
           <w:sz w:val="28"/>
         </w:rPr>
+        <w:lastRenderedPageBreak/>
         <w:t xml:space="preserve">Как видно из рисунка 4, результаты, предсказанные нейросетью, имеют высокую сходимость с результатами имитационного моделирования, что может говорить </w:t>
       </w:r>
       <w:r>
@@ -8823,14 +10358,7 @@
         <w:rPr>
           <w:sz w:val="28"/>
         </w:rPr>
-        <w:t xml:space="preserve">Как видно из результатов оценки на тестовой выборке, среднеквадратическая ошибка значений скоростей не превышает 0,5 м/с и коэффициент детерминации близок единице, что говорит о высокой </w:t>
-      </w:r>
-      <w:r>
-        <w:rPr>
-          <w:sz w:val="28"/>
-        </w:rPr>
-        <w:lastRenderedPageBreak/>
-        <w:t>регуляризации и об отсутствии переобучения нейросети</w:t>
+        <w:t>Как видно из результатов оценки на тестовой выборке, среднеквадратическая ошибка значений скоростей не превышает 0,5 м/с и коэффициент детерминации близок единице, что говорит о высокой регуляризации и об отсутствии переобучения нейросети</w:t>
       </w:r>
       <w:r>
         <w:rPr>
@@ -8914,7 +10442,7 @@
                     <pic:cNvPicPr/>
                   </pic:nvPicPr>
                   <pic:blipFill rotWithShape="1">
-                    <a:blip r:embed="rId13"/>
+                    <a:blip r:embed="rId14"/>
                     <a:srcRect l="32734" t="6025" r="19187" b="7308"/>
                     <a:stretch/>
                   </pic:blipFill>
@@ -8967,7 +10495,7 @@
                     <pic:cNvPicPr/>
                   </pic:nvPicPr>
                   <pic:blipFill>
-                    <a:blip r:embed="rId14"/>
+                    <a:blip r:embed="rId15"/>
                     <a:stretch>
                       <a:fillRect/>
                     </a:stretch>
@@ -9138,7 +10666,7 @@
           <w:color w:val="212121"/>
           <w:sz w:val="21"/>
           <w:szCs w:val="21"/>
-          <w:lang w:eastAsia="ru-RU"/>
+          <w:lang w:val="en-US" w:eastAsia="ru-RU"/>
         </w:rPr>
       </w:pPr>
       <w:r>
@@ -9157,7 +10685,7 @@
           <w:color w:val="212121"/>
           <w:sz w:val="21"/>
           <w:szCs w:val="21"/>
-          <w:lang w:eastAsia="ru-RU"/>
+          <w:lang w:val="en-US" w:eastAsia="ru-RU"/>
         </w:rPr>
         <w:t>(</w:t>
       </w:r>
@@ -9167,7 +10695,7 @@
           <w:color w:val="A709F5"/>
           <w:sz w:val="21"/>
           <w:szCs w:val="21"/>
-          <w:lang w:eastAsia="ru-RU"/>
+          <w:lang w:val="en-US" w:eastAsia="ru-RU"/>
         </w:rPr>
         <w:t>'</w:t>
       </w:r>
@@ -9187,7 +10715,7 @@
           <w:color w:val="A709F5"/>
           <w:sz w:val="21"/>
           <w:szCs w:val="21"/>
-          <w:lang w:eastAsia="ru-RU"/>
+          <w:lang w:val="en-US" w:eastAsia="ru-RU"/>
         </w:rPr>
         <w:t>_4</w:t>
       </w:r>
@@ -9207,7 +10735,7 @@
           <w:color w:val="A709F5"/>
           <w:sz w:val="21"/>
           <w:szCs w:val="21"/>
-          <w:lang w:eastAsia="ru-RU"/>
+          <w:lang w:val="en-US" w:eastAsia="ru-RU"/>
         </w:rPr>
         <w:t>'</w:t>
       </w:r>
@@ -9217,7 +10745,7 @@
           <w:color w:val="212121"/>
           <w:sz w:val="21"/>
           <w:szCs w:val="21"/>
-          <w:lang w:eastAsia="ru-RU"/>
+          <w:lang w:val="en-US" w:eastAsia="ru-RU"/>
         </w:rPr>
         <w:t xml:space="preserve">, </w:t>
       </w:r>
@@ -9227,7 +10755,7 @@
           <w:color w:val="A709F5"/>
           <w:sz w:val="21"/>
           <w:szCs w:val="21"/>
-          <w:lang w:eastAsia="ru-RU"/>
+          <w:lang w:val="en-US" w:eastAsia="ru-RU"/>
         </w:rPr>
         <w:t>'</w:t>
       </w:r>
@@ -9249,7 +10777,7 @@
           <w:color w:val="A709F5"/>
           <w:sz w:val="21"/>
           <w:szCs w:val="21"/>
-          <w:lang w:eastAsia="ru-RU"/>
+          <w:lang w:val="en-US" w:eastAsia="ru-RU"/>
         </w:rPr>
         <w:t>'</w:t>
       </w:r>
@@ -9259,7 +10787,7 @@
           <w:color w:val="212121"/>
           <w:sz w:val="21"/>
           <w:szCs w:val="21"/>
-          <w:lang w:eastAsia="ru-RU"/>
+          <w:lang w:val="en-US" w:eastAsia="ru-RU"/>
         </w:rPr>
         <w:t xml:space="preserve">, </w:t>
       </w:r>
@@ -9279,7 +10807,7 @@
           <w:color w:val="212121"/>
           <w:sz w:val="21"/>
           <w:szCs w:val="21"/>
-          <w:lang w:eastAsia="ru-RU"/>
+          <w:lang w:val="en-US" w:eastAsia="ru-RU"/>
         </w:rPr>
         <w:t>2</w:t>
       </w:r>
@@ -9299,7 +10827,7 @@
           <w:color w:val="212121"/>
           <w:sz w:val="21"/>
           <w:szCs w:val="21"/>
-          <w:lang w:eastAsia="ru-RU"/>
+          <w:lang w:val="en-US" w:eastAsia="ru-RU"/>
         </w:rPr>
         <w:t>(</w:t>
       </w:r>
@@ -9321,7 +10849,7 @@
           <w:color w:val="212121"/>
           <w:sz w:val="21"/>
           <w:szCs w:val="21"/>
-          <w:lang w:eastAsia="ru-RU"/>
+          <w:lang w:val="en-US" w:eastAsia="ru-RU"/>
         </w:rPr>
         <w:t>));</w:t>
       </w:r>
@@ -9426,6 +10954,7 @@
           <w:szCs w:val="21"/>
           <w:lang w:eastAsia="ru-RU"/>
         </w:rPr>
+        <w:lastRenderedPageBreak/>
         <w:t>%Время нейросети</w:t>
       </w:r>
     </w:p>
@@ -9438,18 +10967,28 @@
           <w:color w:val="212121"/>
           <w:sz w:val="21"/>
           <w:szCs w:val="21"/>
-          <w:lang w:val="en-US" w:eastAsia="ru-RU"/>
-        </w:rPr>
-      </w:pPr>
-      <w:r>
-        <w:rPr>
-          <w:rFonts w:ascii="Consolas" w:eastAsia="Times New Roman" w:hAnsi="Consolas" w:cs="Times New Roman"/>
-          <w:color w:val="212121"/>
-          <w:sz w:val="21"/>
-          <w:szCs w:val="21"/>
-          <w:lang w:val="en-US" w:eastAsia="ru-RU"/>
-        </w:rPr>
-        <w:t>tic;</w:t>
+          <w:lang w:eastAsia="ru-RU"/>
+        </w:rPr>
+      </w:pPr>
+      <w:r>
+        <w:rPr>
+          <w:rFonts w:ascii="Consolas" w:eastAsia="Times New Roman" w:hAnsi="Consolas" w:cs="Times New Roman"/>
+          <w:color w:val="212121"/>
+          <w:sz w:val="21"/>
+          <w:szCs w:val="21"/>
+          <w:lang w:val="en-US" w:eastAsia="ru-RU"/>
+        </w:rPr>
+        <w:t>tic</w:t>
+      </w:r>
+      <w:r>
+        <w:rPr>
+          <w:rFonts w:ascii="Consolas" w:eastAsia="Times New Roman" w:hAnsi="Consolas" w:cs="Times New Roman"/>
+          <w:color w:val="212121"/>
+          <w:sz w:val="21"/>
+          <w:szCs w:val="21"/>
+          <w:lang w:eastAsia="ru-RU"/>
+        </w:rPr>
+        <w:t>;</w:t>
       </w:r>
     </w:p>
     <w:p>
@@ -9461,52 +11000,168 @@
           <w:color w:val="212121"/>
           <w:sz w:val="21"/>
           <w:szCs w:val="21"/>
-          <w:lang w:val="en-US" w:eastAsia="ru-RU"/>
-        </w:rPr>
-      </w:pPr>
-      <w:proofErr w:type="spellStart"/>
-      <w:r>
-        <w:rPr>
-          <w:rFonts w:ascii="Consolas" w:eastAsia="Times New Roman" w:hAnsi="Consolas" w:cs="Times New Roman"/>
-          <w:color w:val="212121"/>
-          <w:sz w:val="21"/>
-          <w:szCs w:val="21"/>
-          <w:lang w:val="en-US" w:eastAsia="ru-RU"/>
-        </w:rPr>
-        <w:t>y_pred_norm</w:t>
-      </w:r>
-      <w:proofErr w:type="spellEnd"/>
-      <w:r>
-        <w:rPr>
-          <w:rFonts w:ascii="Consolas" w:eastAsia="Times New Roman" w:hAnsi="Consolas" w:cs="Times New Roman"/>
-          <w:color w:val="212121"/>
-          <w:sz w:val="21"/>
-          <w:szCs w:val="21"/>
-          <w:lang w:val="en-US" w:eastAsia="ru-RU"/>
-        </w:rPr>
-        <w:t xml:space="preserve"> = predict(net, </w:t>
-      </w:r>
-      <w:proofErr w:type="spellStart"/>
-      <w:r>
-        <w:rPr>
-          <w:rFonts w:ascii="Consolas" w:eastAsia="Times New Roman" w:hAnsi="Consolas" w:cs="Times New Roman"/>
-          <w:color w:val="212121"/>
-          <w:sz w:val="21"/>
-          <w:szCs w:val="21"/>
-          <w:lang w:val="en-US" w:eastAsia="ru-RU"/>
-        </w:rPr>
-        <w:t>X_norm</w:t>
-      </w:r>
-      <w:proofErr w:type="spellEnd"/>
-      <w:r>
-        <w:rPr>
-          <w:rFonts w:ascii="Consolas" w:eastAsia="Times New Roman" w:hAnsi="Consolas" w:cs="Times New Roman"/>
-          <w:color w:val="212121"/>
-          <w:sz w:val="21"/>
-          <w:szCs w:val="21"/>
-          <w:lang w:val="en-US" w:eastAsia="ru-RU"/>
-        </w:rPr>
-        <w:t xml:space="preserve">(end,:)); </w:t>
+          <w:lang w:eastAsia="ru-RU"/>
+        </w:rPr>
+      </w:pPr>
+      <w:r>
+        <w:rPr>
+          <w:rFonts w:ascii="Consolas" w:eastAsia="Times New Roman" w:hAnsi="Consolas" w:cs="Times New Roman"/>
+          <w:color w:val="212121"/>
+          <w:sz w:val="21"/>
+          <w:szCs w:val="21"/>
+          <w:lang w:val="en-US" w:eastAsia="ru-RU"/>
+        </w:rPr>
+        <w:t>y</w:t>
+      </w:r>
+      <w:r>
+        <w:rPr>
+          <w:rFonts w:ascii="Consolas" w:eastAsia="Times New Roman" w:hAnsi="Consolas" w:cs="Times New Roman"/>
+          <w:color w:val="212121"/>
+          <w:sz w:val="21"/>
+          <w:szCs w:val="21"/>
+          <w:lang w:eastAsia="ru-RU"/>
+        </w:rPr>
+        <w:t>_</w:t>
+      </w:r>
+      <w:r>
+        <w:rPr>
+          <w:rFonts w:ascii="Consolas" w:eastAsia="Times New Roman" w:hAnsi="Consolas" w:cs="Times New Roman"/>
+          <w:color w:val="212121"/>
+          <w:sz w:val="21"/>
+          <w:szCs w:val="21"/>
+          <w:lang w:val="en-US" w:eastAsia="ru-RU"/>
+        </w:rPr>
+        <w:t>pred</w:t>
+      </w:r>
+      <w:r>
+        <w:rPr>
+          <w:rFonts w:ascii="Consolas" w:eastAsia="Times New Roman" w:hAnsi="Consolas" w:cs="Times New Roman"/>
+          <w:color w:val="212121"/>
+          <w:sz w:val="21"/>
+          <w:szCs w:val="21"/>
+          <w:lang w:eastAsia="ru-RU"/>
+        </w:rPr>
+        <w:t>_</w:t>
+      </w:r>
+      <w:r>
+        <w:rPr>
+          <w:rFonts w:ascii="Consolas" w:eastAsia="Times New Roman" w:hAnsi="Consolas" w:cs="Times New Roman"/>
+          <w:color w:val="212121"/>
+          <w:sz w:val="21"/>
+          <w:szCs w:val="21"/>
+          <w:lang w:val="en-US" w:eastAsia="ru-RU"/>
+        </w:rPr>
+        <w:t>norm</w:t>
+      </w:r>
+      <w:r>
+        <w:rPr>
+          <w:rFonts w:ascii="Consolas" w:eastAsia="Times New Roman" w:hAnsi="Consolas" w:cs="Times New Roman"/>
+          <w:color w:val="212121"/>
+          <w:sz w:val="21"/>
+          <w:szCs w:val="21"/>
+          <w:lang w:eastAsia="ru-RU"/>
+        </w:rPr>
+        <w:t xml:space="preserve"> = </w:t>
+      </w:r>
+      <w:r>
+        <w:rPr>
+          <w:rFonts w:ascii="Consolas" w:eastAsia="Times New Roman" w:hAnsi="Consolas" w:cs="Times New Roman"/>
+          <w:color w:val="212121"/>
+          <w:sz w:val="21"/>
+          <w:szCs w:val="21"/>
+          <w:lang w:val="en-US" w:eastAsia="ru-RU"/>
+        </w:rPr>
+        <w:t>predict</w:t>
+      </w:r>
+      <w:r>
+        <w:rPr>
+          <w:rFonts w:ascii="Consolas" w:eastAsia="Times New Roman" w:hAnsi="Consolas" w:cs="Times New Roman"/>
+          <w:color w:val="212121"/>
+          <w:sz w:val="21"/>
+          <w:szCs w:val="21"/>
+          <w:lang w:eastAsia="ru-RU"/>
+        </w:rPr>
+        <w:t>(</w:t>
+      </w:r>
+      <w:r>
+        <w:rPr>
+          <w:rFonts w:ascii="Consolas" w:eastAsia="Times New Roman" w:hAnsi="Consolas" w:cs="Times New Roman"/>
+          <w:color w:val="212121"/>
+          <w:sz w:val="21"/>
+          <w:szCs w:val="21"/>
+          <w:lang w:val="en-US" w:eastAsia="ru-RU"/>
+        </w:rPr>
+        <w:t>net</w:t>
+      </w:r>
+      <w:r>
+        <w:rPr>
+          <w:rFonts w:ascii="Consolas" w:eastAsia="Times New Roman" w:hAnsi="Consolas" w:cs="Times New Roman"/>
+          <w:color w:val="212121"/>
+          <w:sz w:val="21"/>
+          <w:szCs w:val="21"/>
+          <w:lang w:eastAsia="ru-RU"/>
+        </w:rPr>
+        <w:t xml:space="preserve">, </w:t>
+      </w:r>
+      <w:r>
+        <w:rPr>
+          <w:rFonts w:ascii="Consolas" w:eastAsia="Times New Roman" w:hAnsi="Consolas" w:cs="Times New Roman"/>
+          <w:color w:val="212121"/>
+          <w:sz w:val="21"/>
+          <w:szCs w:val="21"/>
+          <w:lang w:val="en-US" w:eastAsia="ru-RU"/>
+        </w:rPr>
+        <w:t>X</w:t>
+      </w:r>
+      <w:r>
+        <w:rPr>
+          <w:rFonts w:ascii="Consolas" w:eastAsia="Times New Roman" w:hAnsi="Consolas" w:cs="Times New Roman"/>
+          <w:color w:val="212121"/>
+          <w:sz w:val="21"/>
+          <w:szCs w:val="21"/>
+          <w:lang w:eastAsia="ru-RU"/>
+        </w:rPr>
+        <w:t>_</w:t>
+      </w:r>
+      <w:r>
+        <w:rPr>
+          <w:rFonts w:ascii="Consolas" w:eastAsia="Times New Roman" w:hAnsi="Consolas" w:cs="Times New Roman"/>
+          <w:color w:val="212121"/>
+          <w:sz w:val="21"/>
+          <w:szCs w:val="21"/>
+          <w:lang w:val="en-US" w:eastAsia="ru-RU"/>
+        </w:rPr>
+        <w:t>norm</w:t>
+      </w:r>
+      <w:r>
+        <w:rPr>
+          <w:rFonts w:ascii="Consolas" w:eastAsia="Times New Roman" w:hAnsi="Consolas" w:cs="Times New Roman"/>
+          <w:color w:val="212121"/>
+          <w:sz w:val="21"/>
+          <w:szCs w:val="21"/>
+          <w:lang w:eastAsia="ru-RU"/>
+        </w:rPr>
+        <w:t>(</w:t>
+      </w:r>
+      <w:r>
+        <w:rPr>
+          <w:rFonts w:ascii="Consolas" w:eastAsia="Times New Roman" w:hAnsi="Consolas" w:cs="Times New Roman"/>
+          <w:color w:val="212121"/>
+          <w:sz w:val="21"/>
+          <w:szCs w:val="21"/>
+          <w:lang w:val="en-US" w:eastAsia="ru-RU"/>
+        </w:rPr>
+        <w:t>end</w:t>
+      </w:r>
+      <w:r>
+        <w:rPr>
+          <w:rFonts w:ascii="Consolas" w:eastAsia="Times New Roman" w:hAnsi="Consolas" w:cs="Times New Roman"/>
+          <w:color w:val="212121"/>
+          <w:sz w:val="21"/>
+          <w:szCs w:val="21"/>
+          <w:lang w:eastAsia="ru-RU"/>
+        </w:rPr>
+        <w:t xml:space="preserve">,:)); </w:t>
       </w:r>
       <w:r>
         <w:rPr>
@@ -9514,7 +11169,7 @@
           <w:color w:val="008013"/>
           <w:sz w:val="21"/>
           <w:szCs w:val="21"/>
-          <w:lang w:val="en-US" w:eastAsia="ru-RU"/>
+          <w:lang w:eastAsia="ru-RU"/>
         </w:rPr>
         <w:t>%</w:t>
       </w:r>
@@ -9534,7 +11189,7 @@
           <w:color w:val="008013"/>
           <w:sz w:val="21"/>
           <w:szCs w:val="21"/>
-          <w:lang w:val="en-US" w:eastAsia="ru-RU"/>
+          <w:lang w:eastAsia="ru-RU"/>
         </w:rPr>
         <w:t xml:space="preserve"> </w:t>
       </w:r>
@@ -9554,7 +11209,7 @@
           <w:color w:val="008013"/>
           <w:sz w:val="21"/>
           <w:szCs w:val="21"/>
-          <w:lang w:val="en-US" w:eastAsia="ru-RU"/>
+          <w:lang w:eastAsia="ru-RU"/>
         </w:rPr>
         <w:t xml:space="preserve"> </w:t>
       </w:r>
@@ -9574,7 +11229,7 @@
           <w:color w:val="008013"/>
           <w:sz w:val="21"/>
           <w:szCs w:val="21"/>
-          <w:lang w:val="en-US" w:eastAsia="ru-RU"/>
+          <w:lang w:eastAsia="ru-RU"/>
         </w:rPr>
         <w:t xml:space="preserve"> </w:t>
       </w:r>
@@ -9594,7 +11249,7 @@
           <w:color w:val="008013"/>
           <w:sz w:val="21"/>
           <w:szCs w:val="21"/>
-          <w:lang w:val="en-US" w:eastAsia="ru-RU"/>
+          <w:lang w:eastAsia="ru-RU"/>
         </w:rPr>
         <w:t xml:space="preserve"> </w:t>
       </w:r>
@@ -9614,7 +11269,7 @@
           <w:color w:val="008013"/>
           <w:sz w:val="21"/>
           <w:szCs w:val="21"/>
-          <w:lang w:val="en-US" w:eastAsia="ru-RU"/>
+          <w:lang w:eastAsia="ru-RU"/>
         </w:rPr>
         <w:t xml:space="preserve"> </w:t>
       </w:r>
@@ -9628,30 +11283,68 @@
           <w:color w:val="212121"/>
           <w:sz w:val="21"/>
           <w:szCs w:val="21"/>
-          <w:lang w:val="en-US" w:eastAsia="ru-RU"/>
-        </w:rPr>
-      </w:pPr>
-      <w:proofErr w:type="spellStart"/>
-      <w:r>
-        <w:rPr>
-          <w:rFonts w:ascii="Consolas" w:eastAsia="Times New Roman" w:hAnsi="Consolas" w:cs="Times New Roman"/>
-          <w:color w:val="212121"/>
-          <w:sz w:val="21"/>
-          <w:szCs w:val="21"/>
-          <w:lang w:val="en-US" w:eastAsia="ru-RU"/>
-        </w:rPr>
-        <w:t>T_pred</w:t>
-      </w:r>
-      <w:proofErr w:type="spellEnd"/>
-      <w:r>
-        <w:rPr>
-          <w:rFonts w:ascii="Consolas" w:eastAsia="Times New Roman" w:hAnsi="Consolas" w:cs="Times New Roman"/>
-          <w:color w:val="212121"/>
-          <w:sz w:val="21"/>
-          <w:szCs w:val="21"/>
-          <w:lang w:val="en-US" w:eastAsia="ru-RU"/>
-        </w:rPr>
-        <w:t xml:space="preserve"> = toc;</w:t>
+          <w:lang w:eastAsia="ru-RU"/>
+        </w:rPr>
+      </w:pPr>
+      <w:r>
+        <w:rPr>
+          <w:rFonts w:ascii="Consolas" w:eastAsia="Times New Roman" w:hAnsi="Consolas" w:cs="Times New Roman"/>
+          <w:color w:val="212121"/>
+          <w:sz w:val="21"/>
+          <w:szCs w:val="21"/>
+          <w:lang w:val="en-US" w:eastAsia="ru-RU"/>
+        </w:rPr>
+        <w:t>T</w:t>
+      </w:r>
+      <w:r>
+        <w:rPr>
+          <w:rFonts w:ascii="Consolas" w:eastAsia="Times New Roman" w:hAnsi="Consolas" w:cs="Times New Roman"/>
+          <w:color w:val="212121"/>
+          <w:sz w:val="21"/>
+          <w:szCs w:val="21"/>
+          <w:lang w:eastAsia="ru-RU"/>
+        </w:rPr>
+        <w:t>_</w:t>
+      </w:r>
+      <w:r>
+        <w:rPr>
+          <w:rFonts w:ascii="Consolas" w:eastAsia="Times New Roman" w:hAnsi="Consolas" w:cs="Times New Roman"/>
+          <w:color w:val="212121"/>
+          <w:sz w:val="21"/>
+          <w:szCs w:val="21"/>
+          <w:lang w:val="en-US" w:eastAsia="ru-RU"/>
+        </w:rPr>
+        <w:t>pred</w:t>
+      </w:r>
+      <w:r>
+        <w:rPr>
+          <w:rFonts w:ascii="Consolas" w:eastAsia="Times New Roman" w:hAnsi="Consolas" w:cs="Times New Roman"/>
+          <w:color w:val="212121"/>
+          <w:sz w:val="21"/>
+          <w:szCs w:val="21"/>
+          <w:lang w:eastAsia="ru-RU"/>
+        </w:rPr>
+        <w:t xml:space="preserve"> = </w:t>
+      </w:r>
+      <w:r>
+        <w:rPr>
+          <w:rFonts w:ascii="Consolas" w:eastAsia="Times New Roman" w:hAnsi="Consolas" w:cs="Times New Roman"/>
+          <w:color w:val="212121"/>
+          <w:sz w:val="21"/>
+          <w:szCs w:val="21"/>
+          <w:lang w:val="en-US" w:eastAsia="ru-RU"/>
+        </w:rPr>
+        <w:t>toc</w:t>
+      </w:r>
+      <w:r>
+        <w:rPr>
+          <w:rFonts w:ascii="Consolas" w:eastAsia="Times New Roman" w:hAnsi="Consolas" w:cs="Times New Roman"/>
+          <w:color w:val="212121"/>
+          <w:sz w:val="21"/>
+          <w:szCs w:val="21"/>
+          <w:lang w:eastAsia="ru-RU"/>
+        </w:rPr>
+        <w:t>;</w:t>
       </w:r>
     </w:p>
     <w:p>
@@ -9663,7 +11356,7 @@
           <w:color w:val="212121"/>
           <w:sz w:val="21"/>
           <w:szCs w:val="21"/>
-          <w:lang w:val="en-US" w:eastAsia="ru-RU"/>
+          <w:lang w:eastAsia="ru-RU"/>
         </w:rPr>
       </w:pPr>
     </w:p>
@@ -10206,14 +11899,7 @@
         <w:rPr>
           <w:sz w:val="28"/>
         </w:rPr>
-        <w:t xml:space="preserve">Таким образом, можно сделать вывод, что использование нейросетей вместо имитационных моделей имеет достаточно высокую эффективность по критерию производительности при высокой сходимости результатов </w:t>
-      </w:r>
-      <w:r>
-        <w:rPr>
-          <w:sz w:val="28"/>
-        </w:rPr>
-        <w:lastRenderedPageBreak/>
-        <w:t>моделирования и позволяет скрыть от пользователя алгоритмы имитационной модели.</w:t>
+        <w:t>Таким образом, можно сделать вывод, что использование нейросетей вместо имитационных моделей имеет достаточно высокую эффективность по критерию производительности при высокой сходимости результатов моделирования и позволяет скрыть от пользователя алгоритмы имитационной модели.</w:t>
       </w:r>
     </w:p>
     <w:p>
@@ -10292,20 +11978,7 @@
           <w:sz w:val="28"/>
         </w:rPr>
         <w:tab/>
-      </w:r>
-      <w:proofErr w:type="spellStart"/>
-      <w:r>
-        <w:rPr>
-          <w:sz w:val="28"/>
-        </w:rPr>
-        <w:t>Финни</w:t>
-      </w:r>
-      <w:proofErr w:type="spellEnd"/>
-      <w:r>
-        <w:rPr>
-          <w:sz w:val="28"/>
-        </w:rPr>
-        <w:t xml:space="preserve"> Д. И. Введение в теорию планирования экспериментов. М.: Наука, 1970. 288 с.</w:t>
+        <w:t>Финни Д. И. Введение в теорию планирования экспериментов. М.: Наука, 1970. 288 с.</w:t>
       </w:r>
     </w:p>
     <w:p>
@@ -10377,21 +12050,7 @@
           <w:sz w:val="28"/>
         </w:rPr>
         <w:tab/>
-        <w:t xml:space="preserve">Численная оптимизация в </w:t>
-      </w:r>
-      <w:proofErr w:type="spellStart"/>
-      <w:r>
-        <w:rPr>
-          <w:sz w:val="28"/>
-        </w:rPr>
-        <w:t>Matlab</w:t>
-      </w:r>
-      <w:proofErr w:type="spellEnd"/>
-      <w:r>
-        <w:rPr>
-          <w:sz w:val="28"/>
-        </w:rPr>
-        <w:t xml:space="preserve"> [Электронный ресурс]: Электронный ресурс // CodeTown.ru. URL: https://codetown.ru/matlab/optimizaciya (дата обращения: 22.08.2024).</w:t>
+        <w:t>Численная оптимизация в Matlab [Электронный ресурс]: Электронный ресурс // CodeTown.ru. URL: https://codetown.ru/matlab/optimizaciya (дата обращения: 22.08.2024).</w:t>
       </w:r>
     </w:p>
     <w:p>
@@ -10408,6 +12067,7 @@
         <w:rPr>
           <w:sz w:val="28"/>
         </w:rPr>
+        <w:lastRenderedPageBreak/>
         <w:t>6.</w:t>
       </w:r>
       <w:r>
@@ -10415,21 +12075,7 @@
           <w:sz w:val="28"/>
         </w:rPr>
         <w:tab/>
-        <w:t xml:space="preserve">Евграфов В. В., Кондратьев К. Л., </w:t>
-      </w:r>
-      <w:proofErr w:type="spellStart"/>
-      <w:r>
-        <w:rPr>
-          <w:sz w:val="28"/>
-        </w:rPr>
-        <w:t>Ендачев</w:t>
-      </w:r>
-      <w:proofErr w:type="spellEnd"/>
-      <w:r>
-        <w:rPr>
-          <w:sz w:val="28"/>
-        </w:rPr>
-        <w:t xml:space="preserve"> Д. В. Принцип расширения области функционирования высокоавтоматизированных транспортных средств // статья в журнале - научная статья. Москва: ТРУДЫ НАМИ Учредители: Центральный научно-исследовательский автомобильный и автомоторный институт, 2025. № 4. С. 46–56.</w:t>
+        <w:t>Евграфов В. В., Кондратьев К. Л., Ендачев Д. В. Принцип расширения области функционирования высокоавтоматизированных транспортных средств // статья в журнале - научная статья. Москва: ТРУДЫ НАМИ Учредители: Центральный научно-исследовательский автомобильный и автомоторный институт, 2025. № 4. С. 46–56.</w:t>
       </w:r>
     </w:p>
     <w:p>
@@ -10453,20 +12099,7 @@
           <w:sz w:val="28"/>
         </w:rPr>
         <w:tab/>
-      </w:r>
-      <w:proofErr w:type="spellStart"/>
-      <w:r>
-        <w:rPr>
-          <w:sz w:val="28"/>
-        </w:rPr>
-        <w:t>Аипов</w:t>
-      </w:r>
-      <w:proofErr w:type="spellEnd"/>
-      <w:r>
-        <w:rPr>
-          <w:sz w:val="28"/>
-        </w:rPr>
-        <w:t xml:space="preserve"> Т. А. Модель расчетной оценки параметров проходимости автомобиля при повреждении колесного движителя // статья в журнале - научная статья. Москва: РЕМОНТ. ВОССТАНОВЛЕНИЕ. МОДЕРНИЗАЦИЯ Учредители: ООО «Наука и технологии», 2011. № 12. С. 24–28.</w:t>
+        <w:t>Аипов Т. А. Модель расчетной оценки параметров проходимости автомобиля при повреждении колесного движителя // статья в журнале - научная статья. Москва: РЕМОНТ. ВОССТАНОВЛЕНИЕ. МОДЕРНИЗАЦИЯ Учредители: ООО «Наука и технологии», 2011. № 12. С. 24–28.</w:t>
       </w:r>
     </w:p>
     <w:p>
@@ -10490,20 +12123,7 @@
           <w:sz w:val="28"/>
         </w:rPr>
         <w:tab/>
-      </w:r>
-      <w:proofErr w:type="spellStart"/>
-      <w:r>
-        <w:rPr>
-          <w:sz w:val="28"/>
-        </w:rPr>
-        <w:t>Курмаев</w:t>
-      </w:r>
-      <w:proofErr w:type="spellEnd"/>
-      <w:r>
-        <w:rPr>
-          <w:sz w:val="28"/>
-        </w:rPr>
-        <w:t xml:space="preserve"> Р. Х., Лепешкин А. В. Повышение точности математической модели движения колесной машины на основании использования результатов ее испытаний // Известия МГТУ МАМИ. 2009. № 1(7). С. 46–56.</w:t>
+        <w:t>Курмаев Р. Х., Лепешкин А. В. Повышение точности математической модели движения колесной машины на основании использования результатов ее испытаний // Известия МГТУ МАМИ. 2009. № 1(7). С. 46–56.</w:t>
       </w:r>
     </w:p>
     <w:p>
@@ -10520,7 +12140,6 @@
         <w:rPr>
           <w:sz w:val="28"/>
         </w:rPr>
-        <w:lastRenderedPageBreak/>
         <w:t>9.</w:t>
       </w:r>
       <w:r>
@@ -10528,13 +12147,7 @@
           <w:sz w:val="28"/>
         </w:rPr>
         <w:tab/>
-        <w:t xml:space="preserve">Табакарь С. И. Суррогатная нейросеть. Москва, </w:t>
-      </w:r>
-      <w:r>
-        <w:rPr>
-          <w:sz w:val="28"/>
-        </w:rPr>
-        <w:t>[Электронный ресурс]</w:t>
+        <w:t>Табакарь С. И. Суррогатная нейросеть. Москва, [Электронный ресурс] Москва, 2026.</w:t>
       </w:r>
       <w:r>
         <w:rPr>
@@ -10545,24 +12158,6 @@
       <w:r>
         <w:rPr>
           <w:sz w:val="28"/>
-        </w:rPr>
-        <w:t>Москва,</w:t>
-      </w:r>
-      <w:r>
-        <w:rPr>
-          <w:sz w:val="28"/>
-        </w:rPr>
-        <w:t xml:space="preserve"> 2026.</w:t>
-      </w:r>
-      <w:r>
-        <w:rPr>
-          <w:sz w:val="28"/>
-        </w:rPr>
-        <w:t xml:space="preserve"> </w:t>
-      </w:r>
-      <w:r>
-        <w:rPr>
-          <w:sz w:val="28"/>
           <w:lang w:val="en-US"/>
         </w:rPr>
         <w:t>URL</w:t>
@@ -10586,7 +12181,6 @@
         </w:rPr>
         <w:t>://</w:t>
       </w:r>
-      <w:proofErr w:type="spellStart"/>
       <w:r>
         <w:rPr>
           <w:sz w:val="28"/>
@@ -10594,7 +12188,6 @@
         </w:rPr>
         <w:t>github</w:t>
       </w:r>
-      <w:proofErr w:type="spellEnd"/>
       <w:r>
         <w:rPr>
           <w:sz w:val="28"/>
@@ -10614,7 +12207,6 @@
         </w:rPr>
         <w:t>/</w:t>
       </w:r>
-      <w:proofErr w:type="spellStart"/>
       <w:r>
         <w:rPr>
           <w:sz w:val="28"/>
@@ -10622,7 +12214,6 @@
         </w:rPr>
         <w:t>SergTa</w:t>
       </w:r>
-      <w:proofErr w:type="spellEnd"/>
       <w:r>
         <w:rPr>
           <w:sz w:val="28"/>
@@ -10679,37 +12270,7 @@
         <w:rPr>
           <w:sz w:val="28"/>
         </w:rPr>
-        <w:t xml:space="preserve"> </w:t>
-      </w:r>
-      <w:r>
-        <w:rPr>
-          <w:sz w:val="28"/>
-        </w:rPr>
-        <w:t xml:space="preserve">(дата обращения: </w:t>
-      </w:r>
-      <w:r>
-        <w:rPr>
-          <w:sz w:val="28"/>
-        </w:rPr>
-        <w:t>24</w:t>
-      </w:r>
-      <w:r>
-        <w:rPr>
-          <w:sz w:val="28"/>
-        </w:rPr>
-        <w:t>.0</w:t>
-      </w:r>
-      <w:r>
-        <w:rPr>
-          <w:sz w:val="28"/>
-        </w:rPr>
-        <w:t>4</w:t>
-      </w:r>
-      <w:r>
-        <w:rPr>
-          <w:sz w:val="28"/>
-        </w:rPr>
-        <w:t>.2024).</w:t>
+        <w:t xml:space="preserve"> (дата обращения: 24.04.2024).</w:t>
       </w:r>
     </w:p>
     <w:p>
@@ -10733,21 +12294,7 @@
           <w:sz w:val="28"/>
         </w:rPr>
         <w:tab/>
-        <w:t xml:space="preserve">Комбинированный метод трекинга транспортных средств на основе глубокой нейронной сети </w:t>
-      </w:r>
-      <w:proofErr w:type="spellStart"/>
-      <w:r>
-        <w:rPr>
-          <w:sz w:val="28"/>
-        </w:rPr>
-        <w:t>Yolo</w:t>
-      </w:r>
-      <w:proofErr w:type="spellEnd"/>
-      <w:r>
-        <w:rPr>
-          <w:sz w:val="28"/>
-        </w:rPr>
-        <w:t xml:space="preserve"> — Recog.ru [Электронный ресурс]. 2020. URL: https://recog.ru/ (дата обращения: 07.01.2024).</w:t>
+        <w:t>Комбинированный метод трекинга транспортных средств на основе глубокой нейронной сети Yolo — Recog.ru [Электронный ресурс]. 2020. URL: https://recog.ru/ (дата обращения: 07.01.2024).</w:t>
       </w:r>
     </w:p>
     <w:p>
@@ -10797,66 +12344,33 @@
           <w:lang w:val="en-US"/>
         </w:rPr>
         <w:tab/>
-      </w:r>
-      <w:proofErr w:type="spellStart"/>
+        <w:t xml:space="preserve">Shleymovich M. P. </w:t>
+      </w:r>
+      <w:r>
+        <w:rPr>
+          <w:sz w:val="28"/>
+        </w:rPr>
+        <w:t>и</w:t>
+      </w:r>
       <w:r>
         <w:rPr>
           <w:sz w:val="28"/>
           <w:lang w:val="en-US"/>
         </w:rPr>
-        <w:t>Shleymovich</w:t>
-      </w:r>
-      <w:proofErr w:type="spellEnd"/>
+        <w:t xml:space="preserve"> </w:t>
+      </w:r>
+      <w:r>
+        <w:rPr>
+          <w:sz w:val="28"/>
+        </w:rPr>
+        <w:t>др</w:t>
+      </w:r>
       <w:r>
         <w:rPr>
           <w:sz w:val="28"/>
           <w:lang w:val="en-US"/>
         </w:rPr>
-        <w:t xml:space="preserve"> M. P. </w:t>
-      </w:r>
-      <w:r>
-        <w:rPr>
-          <w:sz w:val="28"/>
-        </w:rPr>
-        <w:t>и</w:t>
-      </w:r>
-      <w:r>
-        <w:rPr>
-          <w:sz w:val="28"/>
-          <w:lang w:val="en-US"/>
-        </w:rPr>
-        <w:t xml:space="preserve"> </w:t>
-      </w:r>
-      <w:proofErr w:type="spellStart"/>
-      <w:r>
-        <w:rPr>
-          <w:sz w:val="28"/>
-        </w:rPr>
-        <w:t>др</w:t>
-      </w:r>
-      <w:proofErr w:type="spellEnd"/>
-      <w:r>
-        <w:rPr>
-          <w:sz w:val="28"/>
-          <w:lang w:val="en-US"/>
-        </w:rPr>
-        <w:t xml:space="preserve">. The analysis of images in control systems of unmanned automobiles on the base of energy features model // </w:t>
-      </w:r>
-      <w:proofErr w:type="spellStart"/>
-      <w:r>
-        <w:rPr>
-          <w:sz w:val="28"/>
-          <w:lang w:val="en-US"/>
-        </w:rPr>
-        <w:t>Comput</w:t>
-      </w:r>
-      <w:proofErr w:type="spellEnd"/>
-      <w:r>
-        <w:rPr>
-          <w:sz w:val="28"/>
-          <w:lang w:val="en-US"/>
-        </w:rPr>
-        <w:t xml:space="preserve">. </w:t>
+        <w:t xml:space="preserve">. The analysis of images in control systems of unmanned automobiles on the base of energy features model // Comput. </w:t>
       </w:r>
       <w:r>
         <w:rPr>
@@ -10886,21 +12400,14 @@
           <w:sz w:val="28"/>
         </w:rPr>
         <w:tab/>
-        <w:t xml:space="preserve">Щербин, А. М. Повышение энергоэффективности и безопасности движения электромобилей путем использования </w:t>
-      </w:r>
-      <w:proofErr w:type="spellStart"/>
-      <w:r>
-        <w:rPr>
-          <w:sz w:val="28"/>
-        </w:rPr>
-        <w:t>мехатронных</w:t>
-      </w:r>
-      <w:proofErr w:type="spellEnd"/>
-      <w:r>
-        <w:rPr>
-          <w:sz w:val="28"/>
-        </w:rPr>
-        <w:t xml:space="preserve"> приводов в системах рулевого и тормозного управления // статья в журнале - обзорная статья. Москва: ТРУДЫ НАМИ Учредители: Центральный научно-исследовательский автомобильный и автомоторный институт, 2026. № 1. С. 138–148.</w:t>
+        <w:t>Щербин, А. М. Повышение энергоэффективности и безопасности движения электромобилей путем использования мехатронных приводов в системах рулевого и тормозного управления // статья в журнале - обзорная статья. Москва: ТРУДЫ НАМИ Учредители: Центральный научно-</w:t>
+      </w:r>
+      <w:r>
+        <w:rPr>
+          <w:sz w:val="28"/>
+        </w:rPr>
+        <w:lastRenderedPageBreak/>
+        <w:t>исследовательский автомобильный и автомоторный институт, 2026. № 1. С. 138–148.</w:t>
       </w:r>
     </w:p>
     <w:p>
@@ -10923,12 +12430,675 @@
         <w:fldChar w:fldCharType="end"/>
       </w:r>
     </w:p>
+    <w:p>
+      <w:pPr>
+        <w:pStyle w:val="a0"/>
+        <w:tabs>
+          <w:tab w:val="left" w:pos="264"/>
+          <w:tab w:val="left" w:pos="540"/>
+        </w:tabs>
+        <w:spacing w:line="360" w:lineRule="auto"/>
+        <w:ind w:firstLine="680"/>
+        <w:rPr>
+          <w:sz w:val="28"/>
+        </w:rPr>
+      </w:pPr>
+    </w:p>
+    <w:p>
+      <w:pPr>
+        <w:pStyle w:val="a0"/>
+        <w:tabs>
+          <w:tab w:val="left" w:pos="264"/>
+          <w:tab w:val="left" w:pos="540"/>
+        </w:tabs>
+        <w:spacing w:line="360" w:lineRule="auto"/>
+        <w:ind w:firstLine="680"/>
+        <w:rPr>
+          <w:sz w:val="28"/>
+        </w:rPr>
+      </w:pPr>
+    </w:p>
+    <w:p>
+      <w:pPr>
+        <w:widowControl w:val="0"/>
+        <w:spacing w:after="0" w:line="240" w:lineRule="auto"/>
+        <w:jc w:val="both"/>
+        <w:rPr>
+          <w:rFonts w:ascii="Times New Roman" w:hAnsi="Times New Roman" w:cs="Times New Roman"/>
+          <w:color w:val="000000"/>
+          <w:sz w:val="24"/>
+          <w:szCs w:val="24"/>
+          <w:lang w:val="en-US"/>
+        </w:rPr>
+      </w:pPr>
+      <w:r>
+        <w:rPr>
+          <w:rFonts w:ascii="Times New Roman" w:hAnsi="Times New Roman" w:cs="Times New Roman"/>
+          <w:color w:val="000000"/>
+          <w:sz w:val="24"/>
+          <w:szCs w:val="24"/>
+          <w:lang w:val="en-US"/>
+        </w:rPr>
+        <w:t>/</w:t>
+      </w:r>
+      <w:r>
+        <w:rPr>
+          <w:rFonts w:ascii="Times New Roman" w:hAnsi="Times New Roman" w:cs="Times New Roman"/>
+          <w:color w:val="000000"/>
+          <w:sz w:val="24"/>
+          <w:szCs w:val="24"/>
+        </w:rPr>
+        <w:t>английский</w:t>
+      </w:r>
+      <w:r>
+        <w:rPr>
+          <w:rFonts w:ascii="Times New Roman" w:hAnsi="Times New Roman" w:cs="Times New Roman"/>
+          <w:color w:val="000000"/>
+          <w:sz w:val="24"/>
+          <w:szCs w:val="24"/>
+          <w:lang w:val="en-US"/>
+        </w:rPr>
+        <w:t xml:space="preserve"> </w:t>
+      </w:r>
+      <w:r>
+        <w:rPr>
+          <w:rFonts w:ascii="Times New Roman" w:hAnsi="Times New Roman" w:cs="Times New Roman"/>
+          <w:color w:val="000000"/>
+          <w:sz w:val="24"/>
+          <w:szCs w:val="24"/>
+        </w:rPr>
+        <w:t>блок</w:t>
+      </w:r>
+      <w:r>
+        <w:rPr>
+          <w:rFonts w:ascii="Times New Roman" w:hAnsi="Times New Roman" w:cs="Times New Roman"/>
+          <w:color w:val="000000"/>
+          <w:sz w:val="24"/>
+          <w:szCs w:val="24"/>
+          <w:lang w:val="en-US"/>
+        </w:rPr>
+        <w:t>/</w:t>
+      </w:r>
+    </w:p>
+    <w:p>
+      <w:pPr>
+        <w:shd w:val="clear" w:color="auto" w:fill="FFFFFF"/>
+        <w:spacing w:before="240" w:after="240" w:line="240" w:lineRule="auto"/>
+        <w:rPr>
+          <w:rFonts w:ascii="Times New Roman" w:eastAsia="Times New Roman" w:hAnsi="Times New Roman" w:cs="Times New Roman"/>
+          <w:color w:val="0F1115"/>
+          <w:sz w:val="24"/>
+          <w:szCs w:val="24"/>
+          <w:lang w:val="en-US" w:eastAsia="ru-RU"/>
+        </w:rPr>
+      </w:pPr>
+      <w:r>
+        <w:rPr>
+          <w:rFonts w:ascii="Times New Roman" w:eastAsia="Times New Roman" w:hAnsi="Times New Roman" w:cs="Times New Roman"/>
+          <w:b/>
+          <w:bCs/>
+          <w:color w:val="0F1115"/>
+          <w:sz w:val="24"/>
+          <w:szCs w:val="24"/>
+          <w:lang w:val="en-US" w:eastAsia="ru-RU"/>
+        </w:rPr>
+        <w:t>UDC 004.932:629.11</w:t>
+      </w:r>
+    </w:p>
+    <w:p>
+      <w:pPr>
+        <w:shd w:val="clear" w:color="auto" w:fill="FFFFFF"/>
+        <w:spacing w:before="240" w:after="240" w:line="240" w:lineRule="auto"/>
+        <w:rPr>
+          <w:rFonts w:ascii="Times New Roman" w:eastAsia="Times New Roman" w:hAnsi="Times New Roman" w:cs="Times New Roman"/>
+          <w:color w:val="0F1115"/>
+          <w:sz w:val="24"/>
+          <w:szCs w:val="24"/>
+          <w:lang w:val="en-US" w:eastAsia="ru-RU"/>
+        </w:rPr>
+      </w:pPr>
+      <w:r>
+        <w:rPr>
+          <w:rFonts w:ascii="Times New Roman" w:eastAsia="Times New Roman" w:hAnsi="Times New Roman" w:cs="Times New Roman"/>
+          <w:b/>
+          <w:bCs/>
+          <w:color w:val="0F1115"/>
+          <w:sz w:val="24"/>
+          <w:szCs w:val="24"/>
+          <w:lang w:val="en-US" w:eastAsia="ru-RU"/>
+        </w:rPr>
+        <w:t xml:space="preserve">Sergey I. </w:t>
+      </w:r>
+      <w:proofErr w:type="spellStart"/>
+      <w:r>
+        <w:rPr>
+          <w:rFonts w:ascii="Times New Roman" w:eastAsia="Times New Roman" w:hAnsi="Times New Roman" w:cs="Times New Roman"/>
+          <w:b/>
+          <w:bCs/>
+          <w:color w:val="0F1115"/>
+          <w:sz w:val="24"/>
+          <w:szCs w:val="24"/>
+          <w:lang w:val="en-US" w:eastAsia="ru-RU"/>
+        </w:rPr>
+        <w:t>Tabakar</w:t>
+      </w:r>
+      <w:proofErr w:type="spellEnd"/>
+      <w:r>
+        <w:rPr>
+          <w:rFonts w:ascii="Times New Roman" w:eastAsia="Times New Roman" w:hAnsi="Times New Roman" w:cs="Times New Roman"/>
+          <w:color w:val="0F1115"/>
+          <w:sz w:val="24"/>
+          <w:szCs w:val="24"/>
+          <w:lang w:val="en-US" w:eastAsia="ru-RU"/>
+        </w:rPr>
+        <w:br/>
+        <w:t>Candidate of Technical Sciences, Professor of the Academy of Military Sciences</w:t>
+      </w:r>
+      <w:r>
+        <w:rPr>
+          <w:rFonts w:ascii="Times New Roman" w:eastAsia="Times New Roman" w:hAnsi="Times New Roman" w:cs="Times New Roman"/>
+          <w:color w:val="0F1115"/>
+          <w:sz w:val="24"/>
+          <w:szCs w:val="24"/>
+          <w:lang w:val="en-US" w:eastAsia="ru-RU"/>
+        </w:rPr>
+        <w:br/>
+        <w:t>Chief Specialist</w:t>
+      </w:r>
+      <w:r>
+        <w:rPr>
+          <w:rFonts w:ascii="Times New Roman" w:eastAsia="Times New Roman" w:hAnsi="Times New Roman" w:cs="Times New Roman"/>
+          <w:color w:val="0F1115"/>
+          <w:sz w:val="24"/>
+          <w:szCs w:val="24"/>
+          <w:lang w:val="en-US" w:eastAsia="ru-RU"/>
+        </w:rPr>
+        <w:br/>
+        <w:t>Federal State Unitary Enterprise "Central Order of the Red Banner of Labor Research Automobile and Automotive Engine Institute "NAMI"</w:t>
+      </w:r>
+      <w:r>
+        <w:rPr>
+          <w:rFonts w:ascii="Times New Roman" w:eastAsia="Times New Roman" w:hAnsi="Times New Roman" w:cs="Times New Roman"/>
+          <w:color w:val="0F1115"/>
+          <w:sz w:val="24"/>
+          <w:szCs w:val="24"/>
+          <w:lang w:val="en-US" w:eastAsia="ru-RU"/>
+        </w:rPr>
+        <w:br/>
+        <w:t xml:space="preserve">2 </w:t>
+      </w:r>
+      <w:proofErr w:type="spellStart"/>
+      <w:r>
+        <w:rPr>
+          <w:rFonts w:ascii="Times New Roman" w:eastAsia="Times New Roman" w:hAnsi="Times New Roman" w:cs="Times New Roman"/>
+          <w:color w:val="0F1115"/>
+          <w:sz w:val="24"/>
+          <w:szCs w:val="24"/>
+          <w:lang w:val="en-US" w:eastAsia="ru-RU"/>
+        </w:rPr>
+        <w:t>Avtomotornaya</w:t>
+      </w:r>
+      <w:proofErr w:type="spellEnd"/>
+      <w:r>
+        <w:rPr>
+          <w:rFonts w:ascii="Times New Roman" w:eastAsia="Times New Roman" w:hAnsi="Times New Roman" w:cs="Times New Roman"/>
+          <w:color w:val="0F1115"/>
+          <w:sz w:val="24"/>
+          <w:szCs w:val="24"/>
+          <w:lang w:val="en-US" w:eastAsia="ru-RU"/>
+        </w:rPr>
+        <w:t xml:space="preserve"> St., 125438, Moscow, Russian Federation</w:t>
+      </w:r>
+      <w:r>
+        <w:rPr>
+          <w:rFonts w:ascii="Times New Roman" w:eastAsia="Times New Roman" w:hAnsi="Times New Roman" w:cs="Times New Roman"/>
+          <w:color w:val="0F1115"/>
+          <w:sz w:val="24"/>
+          <w:szCs w:val="24"/>
+          <w:lang w:val="en-US" w:eastAsia="ru-RU"/>
+        </w:rPr>
+        <w:br/>
+      </w:r>
+      <w:r>
+        <w:rPr>
+          <w:rFonts w:ascii="Times New Roman" w:eastAsia="Times New Roman" w:hAnsi="Times New Roman" w:cs="Times New Roman"/>
+          <w:color w:val="0F1115"/>
+          <w:sz w:val="24"/>
+          <w:szCs w:val="24"/>
+          <w:lang w:val="en-US" w:eastAsia="ru-RU"/>
+        </w:rPr>
+        <w:t>Tel.: +7 (</w:t>
+      </w:r>
+      <w:r>
+        <w:rPr>
+          <w:rFonts w:ascii="Times New Roman" w:eastAsia="Times New Roman" w:hAnsi="Times New Roman" w:cs="Times New Roman"/>
+          <w:color w:val="0F1115"/>
+          <w:sz w:val="24"/>
+          <w:szCs w:val="24"/>
+          <w:lang w:val="en-US" w:eastAsia="ru-RU"/>
+        </w:rPr>
+        <w:t>906)744-1978</w:t>
+      </w:r>
+      <w:r>
+        <w:rPr>
+          <w:rFonts w:ascii="Times New Roman" w:eastAsia="Times New Roman" w:hAnsi="Times New Roman" w:cs="Times New Roman"/>
+          <w:color w:val="0F1115"/>
+          <w:sz w:val="24"/>
+          <w:szCs w:val="24"/>
+          <w:lang w:val="en-US" w:eastAsia="ru-RU"/>
+        </w:rPr>
+        <w:br/>
+        <w:t>Email: sergey.tabakar@nami.ru</w:t>
+      </w:r>
+    </w:p>
+    <w:p>
+      <w:pPr>
+        <w:shd w:val="clear" w:color="auto" w:fill="FFFFFF"/>
+        <w:spacing w:before="240" w:after="240" w:line="240" w:lineRule="auto"/>
+        <w:rPr>
+          <w:rFonts w:ascii="Times New Roman" w:eastAsia="Times New Roman" w:hAnsi="Times New Roman" w:cs="Times New Roman"/>
+          <w:color w:val="0F1115"/>
+          <w:sz w:val="24"/>
+          <w:szCs w:val="24"/>
+          <w:lang w:val="en-US" w:eastAsia="ru-RU"/>
+        </w:rPr>
+      </w:pPr>
+      <w:r>
+        <w:rPr>
+          <w:rFonts w:ascii="Times New Roman" w:eastAsia="Times New Roman" w:hAnsi="Times New Roman" w:cs="Times New Roman"/>
+          <w:b/>
+          <w:bCs/>
+          <w:color w:val="0F1115"/>
+          <w:sz w:val="24"/>
+          <w:szCs w:val="24"/>
+          <w:lang w:val="en-US" w:eastAsia="ru-RU"/>
+        </w:rPr>
+        <w:t xml:space="preserve">Maria M. </w:t>
+      </w:r>
+      <w:proofErr w:type="spellStart"/>
+      <w:r>
+        <w:rPr>
+          <w:rFonts w:ascii="Times New Roman" w:eastAsia="Times New Roman" w:hAnsi="Times New Roman" w:cs="Times New Roman"/>
+          <w:b/>
+          <w:bCs/>
+          <w:color w:val="0F1115"/>
+          <w:sz w:val="24"/>
+          <w:szCs w:val="24"/>
+          <w:lang w:val="en-US" w:eastAsia="ru-RU"/>
+        </w:rPr>
+        <w:t>Alferova</w:t>
+      </w:r>
+      <w:proofErr w:type="spellEnd"/>
+      <w:r>
+        <w:rPr>
+          <w:rFonts w:ascii="Times New Roman" w:eastAsia="Times New Roman" w:hAnsi="Times New Roman" w:cs="Times New Roman"/>
+          <w:color w:val="0F1115"/>
+          <w:sz w:val="24"/>
+          <w:szCs w:val="24"/>
+          <w:lang w:val="en-US" w:eastAsia="ru-RU"/>
+        </w:rPr>
+        <w:br/>
+        <w:t>Software Engineer, 2nd Category</w:t>
+      </w:r>
+      <w:r>
+        <w:rPr>
+          <w:rFonts w:ascii="Times New Roman" w:eastAsia="Times New Roman" w:hAnsi="Times New Roman" w:cs="Times New Roman"/>
+          <w:color w:val="0F1115"/>
+          <w:sz w:val="24"/>
+          <w:szCs w:val="24"/>
+          <w:lang w:val="en-US" w:eastAsia="ru-RU"/>
+        </w:rPr>
+        <w:br/>
+        <w:t>Federal State Unitary Enterprise "Central Order of the Red Banner of Labor Research Automobile and Automotive Engine Institute "NAMI"</w:t>
+      </w:r>
+      <w:r>
+        <w:rPr>
+          <w:rFonts w:ascii="Times New Roman" w:eastAsia="Times New Roman" w:hAnsi="Times New Roman" w:cs="Times New Roman"/>
+          <w:color w:val="0F1115"/>
+          <w:sz w:val="24"/>
+          <w:szCs w:val="24"/>
+          <w:lang w:val="en-US" w:eastAsia="ru-RU"/>
+        </w:rPr>
+        <w:br/>
+        <w:t xml:space="preserve">2 </w:t>
+      </w:r>
+      <w:proofErr w:type="spellStart"/>
+      <w:r>
+        <w:rPr>
+          <w:rFonts w:ascii="Times New Roman" w:eastAsia="Times New Roman" w:hAnsi="Times New Roman" w:cs="Times New Roman"/>
+          <w:color w:val="0F1115"/>
+          <w:sz w:val="24"/>
+          <w:szCs w:val="24"/>
+          <w:lang w:val="en-US" w:eastAsia="ru-RU"/>
+        </w:rPr>
+        <w:t>Avtomotornaya</w:t>
+      </w:r>
+      <w:proofErr w:type="spellEnd"/>
+      <w:r>
+        <w:rPr>
+          <w:rFonts w:ascii="Times New Roman" w:eastAsia="Times New Roman" w:hAnsi="Times New Roman" w:cs="Times New Roman"/>
+          <w:color w:val="0F1115"/>
+          <w:sz w:val="24"/>
+          <w:szCs w:val="24"/>
+          <w:lang w:val="en-US" w:eastAsia="ru-RU"/>
+        </w:rPr>
+        <w:t xml:space="preserve"> St., 125438, Moscow, Russian Federation</w:t>
+      </w:r>
+      <w:r>
+        <w:rPr>
+          <w:rFonts w:ascii="Times New Roman" w:eastAsia="Times New Roman" w:hAnsi="Times New Roman" w:cs="Times New Roman"/>
+          <w:color w:val="0F1115"/>
+          <w:sz w:val="24"/>
+          <w:szCs w:val="24"/>
+          <w:lang w:val="en-US" w:eastAsia="ru-RU"/>
+        </w:rPr>
+        <w:br/>
+        <w:t>Tel.: +7 (903) 562-6143</w:t>
+      </w:r>
+      <w:r>
+        <w:rPr>
+          <w:rFonts w:ascii="Times New Roman" w:eastAsia="Times New Roman" w:hAnsi="Times New Roman" w:cs="Times New Roman"/>
+          <w:color w:val="0F1115"/>
+          <w:sz w:val="24"/>
+          <w:szCs w:val="24"/>
+          <w:lang w:val="en-US" w:eastAsia="ru-RU"/>
+        </w:rPr>
+        <w:br/>
+        <w:t>Email: koteyka.mn@gmail.com</w:t>
+      </w:r>
+    </w:p>
+    <w:p>
+      <w:pPr>
+        <w:shd w:val="clear" w:color="auto" w:fill="FFFFFF"/>
+        <w:spacing w:before="240" w:after="240" w:line="240" w:lineRule="auto"/>
+        <w:jc w:val="center"/>
+        <w:rPr>
+          <w:rFonts w:ascii="Times New Roman" w:eastAsia="Times New Roman" w:hAnsi="Times New Roman" w:cs="Times New Roman"/>
+          <w:b/>
+          <w:bCs/>
+          <w:color w:val="0F1115"/>
+          <w:sz w:val="28"/>
+          <w:szCs w:val="28"/>
+          <w:lang w:val="en-US" w:eastAsia="ru-RU"/>
+        </w:rPr>
+      </w:pPr>
+    </w:p>
+    <w:p>
+      <w:pPr>
+        <w:shd w:val="clear" w:color="auto" w:fill="FFFFFF"/>
+        <w:spacing w:before="240" w:after="0" w:line="240" w:lineRule="auto"/>
+        <w:jc w:val="center"/>
+        <w:rPr>
+          <w:rStyle w:val="ae"/>
+          <w:rFonts w:ascii="Times New Roman" w:hAnsi="Times New Roman" w:cs="Times New Roman"/>
+          <w:color w:val="0F1115"/>
+          <w:sz w:val="28"/>
+          <w:shd w:val="clear" w:color="auto" w:fill="FFFFFF"/>
+          <w:lang w:val="en-US"/>
+        </w:rPr>
+      </w:pPr>
+      <w:r>
+        <w:rPr>
+          <w:rStyle w:val="ae"/>
+          <w:rFonts w:ascii="Times New Roman" w:hAnsi="Times New Roman" w:cs="Times New Roman"/>
+          <w:color w:val="0F1115"/>
+          <w:sz w:val="28"/>
+          <w:shd w:val="clear" w:color="auto" w:fill="FFFFFF"/>
+          <w:lang w:val="en-US"/>
+        </w:rPr>
+        <w:t>A SURROGATE NEURAL NETWORK AS AN ALTERNATIVE TO A VEHICLE MOTION SIMULATION MODEL</w:t>
+      </w:r>
+    </w:p>
+    <w:p>
+      <w:pPr>
+        <w:shd w:val="clear" w:color="auto" w:fill="FFFFFF"/>
+        <w:spacing w:before="240" w:after="0" w:line="240" w:lineRule="auto"/>
+        <w:jc w:val="center"/>
+        <w:rPr>
+          <w:rFonts w:ascii="Times New Roman" w:eastAsia="Times New Roman" w:hAnsi="Times New Roman" w:cs="Times New Roman"/>
+          <w:color w:val="0F1115"/>
+          <w:sz w:val="36"/>
+          <w:szCs w:val="28"/>
+          <w:lang w:val="en-US" w:eastAsia="ru-RU"/>
+        </w:rPr>
+      </w:pPr>
+    </w:p>
+    <w:p>
+      <w:pPr>
+        <w:shd w:val="clear" w:color="auto" w:fill="FFFFFF"/>
+        <w:spacing w:after="0" w:line="240" w:lineRule="auto"/>
+        <w:ind w:firstLine="708"/>
+        <w:rPr>
+          <w:rFonts w:ascii="Times New Roman" w:eastAsia="Times New Roman" w:hAnsi="Times New Roman" w:cs="Times New Roman"/>
+          <w:color w:val="0F1115"/>
+          <w:sz w:val="28"/>
+          <w:szCs w:val="28"/>
+          <w:lang w:val="en-US" w:eastAsia="ru-RU"/>
+        </w:rPr>
+      </w:pPr>
+      <w:r>
+        <w:rPr>
+          <w:rFonts w:ascii="Times New Roman" w:eastAsia="Times New Roman" w:hAnsi="Times New Roman" w:cs="Times New Roman"/>
+          <w:b/>
+          <w:bCs/>
+          <w:color w:val="0F1115"/>
+          <w:sz w:val="28"/>
+          <w:szCs w:val="28"/>
+          <w:lang w:val="en-US" w:eastAsia="ru-RU"/>
+        </w:rPr>
+        <w:t>Abstract.</w:t>
+      </w:r>
+      <w:r>
+        <w:rPr>
+          <w:rFonts w:ascii="Times New Roman" w:eastAsia="Times New Roman" w:hAnsi="Times New Roman" w:cs="Times New Roman"/>
+          <w:color w:val="0F1115"/>
+          <w:sz w:val="28"/>
+          <w:szCs w:val="28"/>
+          <w:lang w:val="en-US" w:eastAsia="ru-RU"/>
+        </w:rPr>
+        <w:t> The article addresses the challenges of simulation modeling—namely computational load and open code—by replacing a simulation model with a trained neural network.</w:t>
+      </w:r>
+    </w:p>
+    <w:p>
+      <w:pPr>
+        <w:shd w:val="clear" w:color="auto" w:fill="FFFFFF"/>
+        <w:spacing w:after="0" w:line="240" w:lineRule="auto"/>
+        <w:ind w:firstLine="708"/>
+        <w:rPr>
+          <w:rFonts w:ascii="Times New Roman" w:eastAsia="Times New Roman" w:hAnsi="Times New Roman" w:cs="Times New Roman"/>
+          <w:color w:val="0F1115"/>
+          <w:sz w:val="28"/>
+          <w:szCs w:val="28"/>
+          <w:lang w:val="en-US" w:eastAsia="ru-RU"/>
+        </w:rPr>
+      </w:pPr>
+      <w:r>
+        <w:rPr>
+          <w:rFonts w:ascii="Times New Roman" w:eastAsia="Times New Roman" w:hAnsi="Times New Roman" w:cs="Times New Roman"/>
+          <w:color w:val="0F1115"/>
+          <w:sz w:val="28"/>
+          <w:szCs w:val="28"/>
+          <w:lang w:val="en-US" w:eastAsia="ru-RU"/>
+        </w:rPr>
+        <w:t>The aim of the work is to achieve maximum performance of the surrogate model relative to the original simulation model using a vehicle motion model as a case study.</w:t>
+      </w:r>
+    </w:p>
+    <w:p>
+      <w:pPr>
+        <w:shd w:val="clear" w:color="auto" w:fill="FFFFFF"/>
+        <w:spacing w:after="0" w:line="240" w:lineRule="auto"/>
+        <w:ind w:firstLine="708"/>
+        <w:rPr>
+          <w:rFonts w:ascii="Times New Roman" w:eastAsia="Times New Roman" w:hAnsi="Times New Roman" w:cs="Times New Roman"/>
+          <w:color w:val="0F1115"/>
+          <w:sz w:val="28"/>
+          <w:szCs w:val="28"/>
+          <w:lang w:val="en-US" w:eastAsia="ru-RU"/>
+        </w:rPr>
+      </w:pPr>
+      <w:r>
+        <w:rPr>
+          <w:rFonts w:ascii="Times New Roman" w:eastAsia="Times New Roman" w:hAnsi="Times New Roman" w:cs="Times New Roman"/>
+          <w:color w:val="0F1115"/>
+          <w:sz w:val="28"/>
+          <w:szCs w:val="28"/>
+          <w:lang w:val="en-US" w:eastAsia="ru-RU"/>
+        </w:rPr>
+        <w:t>The study employs machine learning methods, experimental design, and analysis of variance for selecting the architecture and training a fully connected neural network, as well as one-way analysis of variance for comparing model performance</w:t>
+      </w:r>
+      <w:r>
+        <w:rPr>
+          <w:rFonts w:ascii="Times New Roman" w:eastAsia="Times New Roman" w:hAnsi="Times New Roman" w:cs="Times New Roman"/>
+          <w:color w:val="0F1115"/>
+          <w:sz w:val="28"/>
+          <w:szCs w:val="28"/>
+          <w:lang w:val="en-US" w:eastAsia="ru-RU"/>
+        </w:rPr>
+        <w:t>.</w:t>
+      </w:r>
+    </w:p>
+    <w:p>
+      <w:pPr>
+        <w:shd w:val="clear" w:color="auto" w:fill="FFFFFF"/>
+        <w:spacing w:after="0" w:line="240" w:lineRule="auto"/>
+        <w:ind w:firstLine="708"/>
+        <w:rPr>
+          <w:rFonts w:ascii="Times New Roman" w:eastAsia="Times New Roman" w:hAnsi="Times New Roman" w:cs="Times New Roman"/>
+          <w:color w:val="0F1115"/>
+          <w:sz w:val="28"/>
+          <w:szCs w:val="28"/>
+          <w:lang w:val="en-US" w:eastAsia="ru-RU"/>
+        </w:rPr>
+      </w:pPr>
+      <w:r>
+        <w:rPr>
+          <w:rFonts w:ascii="Times New Roman" w:eastAsia="Times New Roman" w:hAnsi="Times New Roman" w:cs="Times New Roman"/>
+          <w:color w:val="0F1115"/>
+          <w:sz w:val="28"/>
+          <w:szCs w:val="28"/>
+          <w:lang w:val="en-US" w:eastAsia="ru-RU"/>
+        </w:rPr>
+        <w:t xml:space="preserve">As a result of the research, the most computationally efficient architecture was identified. The scientific novelty lies in the methodological approach, which constitutes a pipeline of "substituting an architecture from a set — training the neural </w:t>
+      </w:r>
+      <w:r>
+        <w:rPr>
+          <w:rFonts w:ascii="Times New Roman" w:eastAsia="Times New Roman" w:hAnsi="Times New Roman" w:cs="Times New Roman"/>
+          <w:color w:val="0F1115"/>
+          <w:sz w:val="28"/>
+          <w:szCs w:val="28"/>
+          <w:lang w:val="en-US" w:eastAsia="ru-RU"/>
+        </w:rPr>
+        <w:lastRenderedPageBreak/>
+        <w:t>network — validation: evaluating model metrics against a permissible error threshold — computing simulation time."</w:t>
+      </w:r>
+    </w:p>
+    <w:p>
+      <w:pPr>
+        <w:shd w:val="clear" w:color="auto" w:fill="FFFFFF"/>
+        <w:spacing w:after="0" w:line="240" w:lineRule="auto"/>
+        <w:ind w:firstLine="708"/>
+        <w:rPr>
+          <w:rFonts w:ascii="Times New Roman" w:eastAsia="Times New Roman" w:hAnsi="Times New Roman" w:cs="Times New Roman"/>
+          <w:color w:val="0F1115"/>
+          <w:sz w:val="28"/>
+          <w:szCs w:val="28"/>
+          <w:lang w:val="en-US" w:eastAsia="ru-RU"/>
+        </w:rPr>
+      </w:pPr>
+      <w:r>
+        <w:rPr>
+          <w:rFonts w:ascii="Times New Roman" w:eastAsia="Times New Roman" w:hAnsi="Times New Roman" w:cs="Times New Roman"/>
+          <w:color w:val="0F1115"/>
+          <w:sz w:val="28"/>
+          <w:szCs w:val="28"/>
+          <w:lang w:val="en-US" w:eastAsia="ru-RU"/>
+        </w:rPr>
+        <w:t>The practical significance consists in the optimal surrogate neural network architecture obtained through the study.</w:t>
+      </w:r>
+    </w:p>
+    <w:p>
+      <w:pPr>
+        <w:shd w:val="clear" w:color="auto" w:fill="FFFFFF"/>
+        <w:spacing w:after="0" w:line="240" w:lineRule="auto"/>
+        <w:ind w:firstLine="708"/>
+        <w:rPr>
+          <w:rFonts w:ascii="Times New Roman" w:eastAsia="Times New Roman" w:hAnsi="Times New Roman" w:cs="Times New Roman"/>
+          <w:color w:val="0F1115"/>
+          <w:sz w:val="28"/>
+          <w:szCs w:val="28"/>
+          <w:lang w:val="en-US" w:eastAsia="ru-RU"/>
+        </w:rPr>
+      </w:pPr>
+    </w:p>
+    <w:p>
+      <w:pPr>
+        <w:shd w:val="clear" w:color="auto" w:fill="FFFFFF"/>
+        <w:spacing w:after="0" w:line="240" w:lineRule="auto"/>
+        <w:ind w:firstLine="708"/>
+        <w:jc w:val="both"/>
+        <w:rPr>
+          <w:rFonts w:ascii="Times New Roman" w:eastAsia="Times New Roman" w:hAnsi="Times New Roman" w:cs="Times New Roman"/>
+          <w:color w:val="0F1115"/>
+          <w:sz w:val="28"/>
+          <w:szCs w:val="28"/>
+          <w:lang w:val="en-US" w:eastAsia="ru-RU"/>
+        </w:rPr>
+      </w:pPr>
+      <w:r>
+        <w:rPr>
+          <w:rFonts w:ascii="Times New Roman" w:eastAsia="Times New Roman" w:hAnsi="Times New Roman" w:cs="Times New Roman"/>
+          <w:b/>
+          <w:bCs/>
+          <w:color w:val="0F1115"/>
+          <w:sz w:val="28"/>
+          <w:szCs w:val="28"/>
+          <w:lang w:val="en-US" w:eastAsia="ru-RU"/>
+        </w:rPr>
+        <w:t>Keywords:</w:t>
+      </w:r>
+      <w:r>
+        <w:rPr>
+          <w:rFonts w:ascii="Times New Roman" w:eastAsia="Times New Roman" w:hAnsi="Times New Roman" w:cs="Times New Roman"/>
+          <w:color w:val="0F1115"/>
+          <w:sz w:val="28"/>
+          <w:szCs w:val="28"/>
+          <w:lang w:val="en-US" w:eastAsia="ru-RU"/>
+        </w:rPr>
+        <w:t> </w:t>
+      </w:r>
+      <w:r>
+        <w:rPr>
+          <w:rFonts w:ascii="Times New Roman" w:eastAsia="Times New Roman" w:hAnsi="Times New Roman" w:cs="Times New Roman"/>
+          <w:color w:val="0F1115"/>
+          <w:sz w:val="28"/>
+          <w:szCs w:val="28"/>
+          <w:lang w:val="en-US" w:eastAsia="ru-RU"/>
+        </w:rPr>
+        <w:t>SIMULATION MODEL, FULLY CONNECTED NEURAL NETWORK, VEHICLE MOBILITY, MODEL PERFORMANCE, MODEL EXPERIMENT</w:t>
+      </w:r>
+    </w:p>
+    <w:p>
+      <w:pPr>
+        <w:pStyle w:val="a0"/>
+        <w:tabs>
+          <w:tab w:val="left" w:pos="264"/>
+          <w:tab w:val="left" w:pos="540"/>
+        </w:tabs>
+        <w:spacing w:line="360" w:lineRule="auto"/>
+        <w:ind w:firstLine="680"/>
+        <w:rPr>
+          <w:sz w:val="28"/>
+          <w:lang w:val="en-US"/>
+        </w:rPr>
+      </w:pPr>
+    </w:p>
     <w:sectPr>
-      <w:headerReference w:type="default" r:id="rId15"/>
-      <w:footerReference w:type="even" r:id="rId16"/>
+      <w:headerReference w:type="default" r:id="rId16"/>
+      <w:footerReference w:type="even" r:id="rId17"/>
       <w:pgSz w:w="11906" w:h="16838"/>
       <w:pgMar w:top="1134" w:right="1134" w:bottom="1134" w:left="1134" w:header="709" w:footer="709" w:gutter="0"/>
       <w:cols w:space="708"/>
+      <w:titlePg/>
       <w:docGrid w:linePitch="360"/>
     </w:sectPr>
   </w:body>
@@ -11737,6 +13907,7 @@
   <w:style w:type="character" w:default="1" w:styleId="a1">
     <w:name w:val="Default Paragraph Font"/>
     <w:uiPriority w:val="1"/>
+    <w:semiHidden/>
     <w:unhideWhenUsed/>
   </w:style>
   <w:style w:type="table" w:default="1" w:styleId="a2">
@@ -12430,6 +14601,17 @@
       <w:effect w:val="none"/>
     </w:rPr>
   </w:style>
+  <w:style w:type="character" w:styleId="ae">
+    <w:name w:val="Strong"/>
+    <w:basedOn w:val="a1"/>
+    <w:uiPriority w:val="22"/>
+    <w:qFormat/>
+    <w:rsid w:val="003A16BA"/>
+    <w:rPr>
+      <w:b/>
+      <w:bCs/>
+    </w:rPr>
+  </w:style>
 </w:styles>
 </file>
 

</xml_diff>